<commit_message>
preenchi o resumo pré-condições,pós-condições e fluxo principal
</commit_message>
<xml_diff>
--- a/sleep_street.docx
+++ b/sleep_street.docx
@@ -22,7 +22,7 @@
           <w:szCs w:val="24"/>
           <w:rtl w:val="0"/>
         </w:rPr>
-        <w:t xml:space="preserve">DOCUMENTO DE VISÃO E CONCEPÇÃO DO PRODUTO </w:t>
+        <w:t xml:space="preserve">- RN02 - Nota de localização deve ser entre 1 e 5.- RN02 - Nota de localização deve ser entre 1 e 5.- RN02 - Nota de localização deve ser entre 1 e 5.- RN02 - Nota de localização deve ser entre 1 e 5.- RN02 - Nota de localização deve ser entre 1 e 5.- RN02 - Nota de localização deve ser entre 1 e 5.- RN02 - Nota de localização deve ser entre 1 e 5.- RN02 - Nota de localização deve ser entre 1 e 5.- RN02 - Nota de localização deve ser entre 1 e 5.- RN02 - Nota de localização deve ser entre 1 e 5.DOCUMENTO DE VISÃO E CONCEPÇÃO DO PRODUTO </w:t>
       </w:r>
     </w:p>
     <w:p>
@@ -1671,7 +1671,7 @@
     <w:tbl>
       <w:tblPr>
         <w:tblStyle w:val="Table1"/>
-        <w:tblW w:w="10480.0" w:type="dxa"/>
+        <w:tblW w:w="15375.0" w:type="dxa"/>
         <w:jc w:val="left"/>
         <w:tblBorders>
           <w:top w:color="000000" w:space="0" w:sz="8" w:val="single"/>
@@ -1689,14 +1689,14 @@
         <w:gridCol w:w="3420"/>
         <w:gridCol w:w="1500"/>
         <w:gridCol w:w="1440"/>
-        <w:gridCol w:w="1360"/>
+        <w:gridCol w:w="6255"/>
         <w:tblGridChange w:id="0">
           <w:tblGrid>
             <w:gridCol w:w="2760"/>
             <w:gridCol w:w="3420"/>
             <w:gridCol w:w="1500"/>
             <w:gridCol w:w="1440"/>
-            <w:gridCol w:w="1360"/>
+            <w:gridCol w:w="6255"/>
           </w:tblGrid>
         </w:tblGridChange>
       </w:tblGrid>
@@ -3869,9 +3869,25 @@
         </w:rPr>
       </w:r>
     </w:p>
+    <w:p>
+      <w:pPr>
+        <w:spacing w:line="360" w:lineRule="auto"/>
+        <w:jc w:val="both"/>
+        <w:rPr>
+          <w:sz w:val="24"/>
+          <w:szCs w:val="24"/>
+        </w:rPr>
+      </w:pPr>
+      <w:r>
+        <w:rPr>
+          <w:rtl w:val="0"/>
+        </w:rPr>
+      </w:r>
+    </w:p>
     <w:tbl>
       <w:tblPr>
         <w:tblStyle w:val="Table4"/>
+        <w:tblpPr w:leftFromText="180" w:rightFromText="180" w:topFromText="180" w:bottomFromText="180" w:vertAnchor="text" w:horzAnchor="text" w:tblpX="-120" w:tblpY="0"/>
         <w:tblW w:w="10460.0" w:type="dxa"/>
         <w:jc w:val="left"/>
         <w:tblBorders>
@@ -3903,13 +3919,6 @@
         <w:tc>
           <w:tcPr>
             <w:shd w:fill="999999" w:val="clear"/>
-            <w:tcMar>
-              <w:top w:w="100.0" w:type="dxa"/>
-              <w:left w:w="100.0" w:type="dxa"/>
-              <w:bottom w:w="100.0" w:type="dxa"/>
-              <w:right w:w="100.0" w:type="dxa"/>
-            </w:tcMar>
-            <w:vAlign w:val="top"/>
           </w:tcPr>
           <w:p>
             <w:pPr>
@@ -3934,6 +3943,1276 @@
             </w:r>
           </w:p>
         </w:tc>
+        <w:tc>
+          <w:tcPr>
+            <w:shd w:fill="999999" w:val="clear"/>
+          </w:tcPr>
+          <w:p>
+            <w:pPr>
+              <w:widowControl w:val="0"/>
+              <w:spacing w:line="240" w:lineRule="auto"/>
+              <w:rPr>
+                <w:b w:val="1"/>
+                <w:bCs w:val="1"/>
+                <w:sz w:val="24"/>
+                <w:szCs w:val="24"/>
+              </w:rPr>
+            </w:pPr>
+            <w:r>
+              <w:rPr>
+                <w:rtl w:val="0"/>
+              </w:rPr>
+            </w:r>
+          </w:p>
+        </w:tc>
+      </w:tr>
+      <w:tr>
+        <w:trPr>
+          <w:cantSplit w:val="0"/>
+          <w:tblHeader w:val="0"/>
+        </w:trPr>
+        <w:tc>
+          <w:tcPr>
+            <w:shd w:fill="999999" w:val="clear"/>
+          </w:tcPr>
+          <w:p>
+            <w:pPr>
+              <w:widowControl w:val="0"/>
+              <w:spacing w:line="240" w:lineRule="auto"/>
+              <w:rPr>
+                <w:b w:val="1"/>
+                <w:bCs w:val="1"/>
+                <w:sz w:val="24"/>
+                <w:szCs w:val="24"/>
+              </w:rPr>
+            </w:pPr>
+            <w:r>
+              <w:rPr>
+                <w:b w:val="1"/>
+                <w:bCs w:val="1"/>
+                <w:sz w:val="24"/>
+                <w:szCs w:val="24"/>
+                <w:rtl w:val="0"/>
+              </w:rPr>
+              <w:t xml:space="preserve">Ator Principal: </w:t>
+            </w:r>
+          </w:p>
+        </w:tc>
+        <w:tc>
+          <w:tcPr/>
+          <w:p>
+            <w:pPr>
+              <w:rPr/>
+            </w:pPr>
+            <w:r>
+              <w:rPr>
+                <w:rtl w:val="0"/>
+              </w:rPr>
+              <w:t xml:space="preserve">Viajante Solo (Cliente)</w:t>
+            </w:r>
+          </w:p>
+          <w:p>
+            <w:pPr>
+              <w:widowControl w:val="0"/>
+              <w:spacing w:line="240" w:lineRule="auto"/>
+              <w:rPr>
+                <w:sz w:val="24"/>
+                <w:szCs w:val="24"/>
+              </w:rPr>
+            </w:pPr>
+            <w:r>
+              <w:rPr>
+                <w:rtl w:val="0"/>
+              </w:rPr>
+            </w:r>
+          </w:p>
+        </w:tc>
+      </w:tr>
+      <w:tr>
+        <w:trPr>
+          <w:cantSplit w:val="0"/>
+          <w:tblHeader w:val="0"/>
+        </w:trPr>
+        <w:tc>
+          <w:tcPr>
+            <w:shd w:fill="999999" w:val="clear"/>
+          </w:tcPr>
+          <w:p>
+            <w:pPr>
+              <w:widowControl w:val="0"/>
+              <w:spacing w:line="240" w:lineRule="auto"/>
+              <w:rPr>
+                <w:b w:val="1"/>
+                <w:bCs w:val="1"/>
+                <w:sz w:val="24"/>
+                <w:szCs w:val="24"/>
+              </w:rPr>
+            </w:pPr>
+            <w:r>
+              <w:rPr>
+                <w:b w:val="1"/>
+                <w:bCs w:val="1"/>
+                <w:sz w:val="24"/>
+                <w:szCs w:val="24"/>
+                <w:rtl w:val="0"/>
+              </w:rPr>
+              <w:t xml:space="preserve">Resumo: </w:t>
+            </w:r>
+          </w:p>
+        </w:tc>
+        <w:tc>
+          <w:tcPr/>
+          <w:p>
+            <w:pPr>
+              <w:rPr/>
+            </w:pPr>
+            <w:r>
+              <w:rPr>
+                <w:rtl w:val="0"/>
+              </w:rPr>
+              <w:t xml:space="preserve">O viajante pode dar nota aos locais (hotéis, museus, lanchonetes) que está visitando. Pode ver o horário de abertura, fechamento e faixa de preço. O sistema permite solicitar reembolso em caso de problemas e informa o valor total ao usuário.</w:t>
+            </w:r>
+          </w:p>
+          <w:p>
+            <w:pPr>
+              <w:rPr/>
+            </w:pPr>
+            <w:r>
+              <w:rPr>
+                <w:rtl w:val="0"/>
+              </w:rPr>
+            </w:r>
+          </w:p>
+          <w:p>
+            <w:pPr>
+              <w:widowControl w:val="0"/>
+              <w:spacing w:line="240" w:lineRule="auto"/>
+              <w:rPr>
+                <w:sz w:val="24"/>
+                <w:szCs w:val="24"/>
+              </w:rPr>
+            </w:pPr>
+            <w:r>
+              <w:rPr>
+                <w:rtl w:val="0"/>
+              </w:rPr>
+            </w:r>
+          </w:p>
+        </w:tc>
+      </w:tr>
+      <w:tr>
+        <w:trPr>
+          <w:cantSplit w:val="0"/>
+          <w:tblHeader w:val="0"/>
+        </w:trPr>
+        <w:tc>
+          <w:tcPr>
+            <w:shd w:fill="999999" w:val="clear"/>
+          </w:tcPr>
+          <w:p>
+            <w:pPr>
+              <w:widowControl w:val="0"/>
+              <w:spacing w:line="240" w:lineRule="auto"/>
+              <w:rPr>
+                <w:b w:val="1"/>
+                <w:bCs w:val="1"/>
+                <w:sz w:val="24"/>
+                <w:szCs w:val="24"/>
+              </w:rPr>
+            </w:pPr>
+            <w:r>
+              <w:rPr>
+                <w:b w:val="1"/>
+                <w:bCs w:val="1"/>
+                <w:sz w:val="24"/>
+                <w:szCs w:val="24"/>
+                <w:rtl w:val="0"/>
+              </w:rPr>
+              <w:t xml:space="preserve">Pré-condições: </w:t>
+            </w:r>
+          </w:p>
+        </w:tc>
+        <w:tc>
+          <w:tcPr/>
+          <w:p>
+            <w:pPr>
+              <w:rPr/>
+            </w:pPr>
+            <w:r>
+              <w:rPr>
+                <w:rtl w:val="0"/>
+              </w:rPr>
+              <w:t xml:space="preserve">- O usuário está logado.</w:t>
+            </w:r>
+          </w:p>
+          <w:p>
+            <w:pPr>
+              <w:rPr/>
+            </w:pPr>
+            <w:r>
+              <w:rPr>
+                <w:rtl w:val="0"/>
+              </w:rPr>
+              <w:t xml:space="preserve">- Tem uma viagem em andamento.</w:t>
+            </w:r>
+          </w:p>
+          <w:p>
+            <w:pPr>
+              <w:widowControl w:val="0"/>
+              <w:spacing w:line="240" w:lineRule="auto"/>
+              <w:rPr>
+                <w:sz w:val="24"/>
+                <w:szCs w:val="24"/>
+              </w:rPr>
+            </w:pPr>
+            <w:r>
+              <w:rPr>
+                <w:rtl w:val="0"/>
+              </w:rPr>
+            </w:r>
+          </w:p>
+        </w:tc>
+      </w:tr>
+      <w:tr>
+        <w:trPr>
+          <w:cantSplit w:val="0"/>
+          <w:tblHeader w:val="0"/>
+        </w:trPr>
+        <w:tc>
+          <w:tcPr>
+            <w:shd w:fill="999999" w:val="clear"/>
+          </w:tcPr>
+          <w:p>
+            <w:pPr>
+              <w:widowControl w:val="0"/>
+              <w:spacing w:line="240" w:lineRule="auto"/>
+              <w:rPr>
+                <w:b w:val="1"/>
+                <w:bCs w:val="1"/>
+                <w:sz w:val="24"/>
+                <w:szCs w:val="24"/>
+              </w:rPr>
+            </w:pPr>
+            <w:r>
+              <w:rPr>
+                <w:b w:val="1"/>
+                <w:bCs w:val="1"/>
+                <w:sz w:val="24"/>
+                <w:szCs w:val="24"/>
+                <w:rtl w:val="0"/>
+              </w:rPr>
+              <w:t xml:space="preserve">Pós-condições: </w:t>
+            </w:r>
+          </w:p>
+        </w:tc>
+        <w:tc>
+          <w:tcPr/>
+          <w:p>
+            <w:pPr>
+              <w:rPr/>
+            </w:pPr>
+            <w:r>
+              <w:rPr>
+                <w:rtl w:val="0"/>
+              </w:rPr>
+              <w:t xml:space="preserve">- O reembolso é solicitado e o valor total é calculado.</w:t>
+            </w:r>
+          </w:p>
+          <w:p>
+            <w:pPr>
+              <w:rPr/>
+            </w:pPr>
+            <w:r>
+              <w:rPr>
+                <w:rtl w:val="0"/>
+              </w:rPr>
+              <w:t xml:space="preserve">- A nota e as informações do local são salvos.</w:t>
+            </w:r>
+          </w:p>
+          <w:p>
+            <w:pPr>
+              <w:widowControl w:val="0"/>
+              <w:spacing w:line="240" w:lineRule="auto"/>
+              <w:rPr>
+                <w:sz w:val="24"/>
+                <w:szCs w:val="24"/>
+              </w:rPr>
+            </w:pPr>
+            <w:r>
+              <w:rPr>
+                <w:rtl w:val="0"/>
+              </w:rPr>
+            </w:r>
+          </w:p>
+        </w:tc>
+      </w:tr>
+      <w:tr>
+        <w:trPr>
+          <w:cantSplit w:val="0"/>
+          <w:tblHeader w:val="0"/>
+        </w:trPr>
+        <w:tc>
+          <w:tcPr>
+            <w:shd w:fill="999999" w:val="clear"/>
+          </w:tcPr>
+          <w:p>
+            <w:pPr>
+              <w:widowControl w:val="0"/>
+              <w:spacing w:line="240" w:lineRule="auto"/>
+              <w:rPr>
+                <w:b w:val="1"/>
+                <w:bCs w:val="1"/>
+                <w:sz w:val="24"/>
+                <w:szCs w:val="24"/>
+              </w:rPr>
+            </w:pPr>
+            <w:r>
+              <w:rPr>
+                <w:b w:val="1"/>
+                <w:bCs w:val="1"/>
+                <w:sz w:val="24"/>
+                <w:szCs w:val="24"/>
+                <w:rtl w:val="0"/>
+              </w:rPr>
+              <w:t xml:space="preserve">Fluxo Principal: </w:t>
+            </w:r>
+          </w:p>
+        </w:tc>
+        <w:tc>
+          <w:tcPr/>
+          <w:p>
+            <w:pPr>
+              <w:rPr/>
+            </w:pPr>
+            <w:r>
+              <w:rPr>
+                <w:rtl w:val="0"/>
+              </w:rPr>
+              <w:t xml:space="preserve">1. Durante a viagem, o usuário clica em "Problemas" no card do local.</w:t>
+            </w:r>
+          </w:p>
+          <w:p>
+            <w:pPr>
+              <w:rPr/>
+            </w:pPr>
+            <w:r>
+              <w:rPr>
+                <w:rtl w:val="0"/>
+              </w:rPr>
+              <w:t xml:space="preserve">2. Escolha o motivo do problema.</w:t>
+            </w:r>
+          </w:p>
+          <w:p>
+            <w:pPr>
+              <w:rPr/>
+            </w:pPr>
+            <w:r>
+              <w:rPr>
+                <w:rtl w:val="0"/>
+              </w:rPr>
+              <w:t xml:space="preserve">3. Enviar foto e descrição.</w:t>
+            </w:r>
+          </w:p>
+          <w:p>
+            <w:pPr>
+              <w:rPr/>
+            </w:pPr>
+            <w:r>
+              <w:rPr>
+                <w:rtl w:val="0"/>
+              </w:rPr>
+              <w:t xml:space="preserve">4. O sistema calcula o reembolso e mostra valor total.</w:t>
+            </w:r>
+          </w:p>
+          <w:p>
+            <w:pPr>
+              <w:rPr/>
+            </w:pPr>
+            <w:r>
+              <w:rPr>
+                <w:rtl w:val="0"/>
+              </w:rPr>
+              <w:t xml:space="preserve">5. Clica em "Solicitar".</w:t>
+            </w:r>
+          </w:p>
+          <w:p>
+            <w:pPr>
+              <w:rPr/>
+            </w:pPr>
+            <w:r>
+              <w:rPr>
+                <w:rtl w:val="0"/>
+              </w:rPr>
+              <w:t xml:space="preserve">6. O usuário acessa o cartão do local na viagem.</w:t>
+            </w:r>
+          </w:p>
+          <w:p>
+            <w:pPr>
+              <w:rPr/>
+            </w:pPr>
+            <w:r>
+              <w:rPr>
+                <w:rtl w:val="0"/>
+              </w:rPr>
+              <w:t xml:space="preserve">7. Clica em "Dar nota".</w:t>
+            </w:r>
+          </w:p>
+          <w:p>
+            <w:pPr>
+              <w:rPr/>
+            </w:pPr>
+            <w:r>
+              <w:rPr>
+                <w:rtl w:val="0"/>
+              </w:rPr>
+              <w:t xml:space="preserve">8. Escolhe nota de 1 a 5.</w:t>
+            </w:r>
+          </w:p>
+          <w:p>
+            <w:pPr>
+              <w:rPr/>
+            </w:pPr>
+            <w:r>
+              <w:rPr>
+                <w:rtl w:val="0"/>
+              </w:rPr>
+              <w:t xml:space="preserve">9. Clica em "Salvar".</w:t>
+            </w:r>
+          </w:p>
+          <w:p>
+            <w:pPr>
+              <w:rPr/>
+            </w:pPr>
+            <w:r>
+              <w:rPr>
+                <w:rtl w:val="0"/>
+              </w:rPr>
+              <w:t xml:space="preserve">10. O sistema mostra horário, fechamento e faixa de preço.</w:t>
+            </w:r>
+          </w:p>
+          <w:p>
+            <w:pPr>
+              <w:rPr/>
+            </w:pPr>
+            <w:r>
+              <w:rPr>
+                <w:rtl w:val="0"/>
+              </w:rPr>
+            </w:r>
+          </w:p>
+          <w:p>
+            <w:pPr>
+              <w:rPr/>
+            </w:pPr>
+            <w:r>
+              <w:rPr>
+                <w:rtl w:val="0"/>
+              </w:rPr>
+            </w:r>
+          </w:p>
+        </w:tc>
+      </w:tr>
+      <w:tr>
+        <w:trPr>
+          <w:cantSplit w:val="0"/>
+          <w:tblHeader w:val="0"/>
+        </w:trPr>
+        <w:tc>
+          <w:tcPr>
+            <w:shd w:fill="999999" w:val="clear"/>
+          </w:tcPr>
+          <w:p>
+            <w:pPr>
+              <w:widowControl w:val="0"/>
+              <w:spacing w:line="240" w:lineRule="auto"/>
+              <w:rPr>
+                <w:b w:val="1"/>
+                <w:bCs w:val="1"/>
+                <w:sz w:val="24"/>
+                <w:szCs w:val="24"/>
+              </w:rPr>
+            </w:pPr>
+            <w:r>
+              <w:rPr>
+                <w:b w:val="1"/>
+                <w:bCs w:val="1"/>
+                <w:sz w:val="24"/>
+                <w:szCs w:val="24"/>
+                <w:rtl w:val="0"/>
+              </w:rPr>
+              <w:t xml:space="preserve">Fluxos Alternativos: </w:t>
+            </w:r>
+          </w:p>
+        </w:tc>
+        <w:tc>
+          <w:tcPr/>
+          <w:p>
+            <w:pPr>
+              <w:widowControl w:val="0"/>
+              <w:spacing w:line="240" w:lineRule="auto"/>
+              <w:rPr>
+                <w:b w:val="1"/>
+                <w:bCs w:val="1"/>
+                <w:sz w:val="24"/>
+                <w:szCs w:val="24"/>
+              </w:rPr>
+            </w:pPr>
+            <w:r>
+              <w:rPr>
+                <w:b w:val="1"/>
+                <w:bCs w:val="1"/>
+                <w:sz w:val="24"/>
+                <w:szCs w:val="24"/>
+                <w:rtl w:val="0"/>
+              </w:rPr>
+              <w:t xml:space="preserve">FA01 - Aplicação de Frete Grátis:</w:t>
+            </w:r>
+          </w:p>
+          <w:p>
+            <w:pPr>
+              <w:widowControl w:val="0"/>
+              <w:spacing w:line="240" w:lineRule="auto"/>
+              <w:rPr>
+                <w:sz w:val="24"/>
+                <w:szCs w:val="24"/>
+              </w:rPr>
+            </w:pPr>
+            <w:r>
+              <w:rPr>
+                <w:rtl w:val="0"/>
+              </w:rPr>
+            </w:r>
+          </w:p>
+          <w:p>
+            <w:pPr>
+              <w:widowControl w:val="0"/>
+              <w:numPr>
+                <w:ilvl w:val="0"/>
+                <w:numId w:val="2"/>
+              </w:numPr>
+              <w:spacing w:line="240" w:lineRule="auto"/>
+              <w:ind w:left="720" w:hanging="360"/>
+              <w:rPr>
+                <w:sz w:val="24"/>
+                <w:szCs w:val="24"/>
+              </w:rPr>
+            </w:pPr>
+            <w:r>
+              <w:rPr>
+                <w:b w:val="1"/>
+                <w:bCs w:val="1"/>
+                <w:sz w:val="24"/>
+                <w:szCs w:val="24"/>
+                <w:rtl w:val="0"/>
+              </w:rPr>
+              <w:t xml:space="preserve">3a.</w:t>
+            </w:r>
+            <w:r>
+              <w:rPr>
+                <w:sz w:val="24"/>
+                <w:szCs w:val="24"/>
+                <w:rtl w:val="0"/>
+              </w:rPr>
+              <w:t xml:space="preserve"> O sistema identifica que o CEP pertence à mesma região metropolitana do CD ou que o cliente é membro ativo do programa de fidelidade. </w:t>
+            </w:r>
+          </w:p>
+          <w:p>
+            <w:pPr>
+              <w:widowControl w:val="0"/>
+              <w:spacing w:line="240" w:lineRule="auto"/>
+              <w:ind w:left="720" w:firstLine="0"/>
+              <w:rPr>
+                <w:sz w:val="24"/>
+                <w:szCs w:val="24"/>
+              </w:rPr>
+            </w:pPr>
+            <w:r>
+              <w:rPr>
+                <w:rtl w:val="0"/>
+              </w:rPr>
+            </w:r>
+          </w:p>
+          <w:p>
+            <w:pPr>
+              <w:widowControl w:val="0"/>
+              <w:numPr>
+                <w:ilvl w:val="0"/>
+                <w:numId w:val="2"/>
+              </w:numPr>
+              <w:spacing w:line="240" w:lineRule="auto"/>
+              <w:ind w:left="720" w:hanging="360"/>
+              <w:rPr>
+                <w:sz w:val="24"/>
+                <w:szCs w:val="24"/>
+              </w:rPr>
+            </w:pPr>
+            <w:r>
+              <w:rPr>
+                <w:b w:val="1"/>
+                <w:bCs w:val="1"/>
+                <w:sz w:val="24"/>
+                <w:szCs w:val="24"/>
+                <w:rtl w:val="0"/>
+              </w:rPr>
+              <w:t xml:space="preserve">3b.</w:t>
+            </w:r>
+            <w:r>
+              <w:rPr>
+                <w:sz w:val="24"/>
+                <w:szCs w:val="24"/>
+                <w:rtl w:val="0"/>
+              </w:rPr>
+              <w:t xml:space="preserve"> O sistema aplica isenção total de frete (R$0,00) ao carrinho. </w:t>
+            </w:r>
+          </w:p>
+          <w:p>
+            <w:pPr>
+              <w:widowControl w:val="0"/>
+              <w:spacing w:line="240" w:lineRule="auto"/>
+              <w:rPr>
+                <w:sz w:val="24"/>
+                <w:szCs w:val="24"/>
+              </w:rPr>
+            </w:pPr>
+            <w:r>
+              <w:rPr>
+                <w:rtl w:val="0"/>
+              </w:rPr>
+            </w:r>
+          </w:p>
+        </w:tc>
+      </w:tr>
+      <w:tr>
+        <w:trPr>
+          <w:cantSplit w:val="0"/>
+          <w:tblHeader w:val="0"/>
+        </w:trPr>
+        <w:tc>
+          <w:tcPr>
+            <w:shd w:fill="999999" w:val="clear"/>
+          </w:tcPr>
+          <w:p>
+            <w:pPr>
+              <w:widowControl w:val="0"/>
+              <w:spacing w:line="240" w:lineRule="auto"/>
+              <w:rPr>
+                <w:b w:val="1"/>
+                <w:bCs w:val="1"/>
+                <w:sz w:val="24"/>
+                <w:szCs w:val="24"/>
+              </w:rPr>
+            </w:pPr>
+            <w:r>
+              <w:rPr>
+                <w:b w:val="1"/>
+                <w:bCs w:val="1"/>
+                <w:sz w:val="24"/>
+                <w:szCs w:val="24"/>
+                <w:rtl w:val="0"/>
+              </w:rPr>
+              <w:t xml:space="preserve">Fluxos de Exceção: </w:t>
+            </w:r>
+          </w:p>
+        </w:tc>
+        <w:tc>
+          <w:tcPr/>
+          <w:p>
+            <w:pPr>
+              <w:widowControl w:val="0"/>
+              <w:spacing w:line="240" w:lineRule="auto"/>
+              <w:rPr>
+                <w:b w:val="1"/>
+                <w:bCs w:val="1"/>
+                <w:sz w:val="24"/>
+                <w:szCs w:val="24"/>
+              </w:rPr>
+            </w:pPr>
+            <w:r>
+              <w:rPr>
+                <w:b w:val="1"/>
+                <w:bCs w:val="1"/>
+                <w:sz w:val="24"/>
+                <w:szCs w:val="24"/>
+                <w:rtl w:val="0"/>
+              </w:rPr>
+              <w:t xml:space="preserve">FE01 - Indisponibilidade na API da Transportadora:</w:t>
+            </w:r>
+          </w:p>
+          <w:p>
+            <w:pPr>
+              <w:widowControl w:val="0"/>
+              <w:spacing w:line="240" w:lineRule="auto"/>
+              <w:rPr>
+                <w:sz w:val="24"/>
+                <w:szCs w:val="24"/>
+              </w:rPr>
+            </w:pPr>
+            <w:r>
+              <w:rPr>
+                <w:rtl w:val="0"/>
+              </w:rPr>
+            </w:r>
+          </w:p>
+          <w:p>
+            <w:pPr>
+              <w:widowControl w:val="0"/>
+              <w:numPr>
+                <w:ilvl w:val="0"/>
+                <w:numId w:val="7"/>
+              </w:numPr>
+              <w:spacing w:line="240" w:lineRule="auto"/>
+              <w:ind w:left="720" w:hanging="360"/>
+              <w:rPr>
+                <w:sz w:val="24"/>
+                <w:szCs w:val="24"/>
+              </w:rPr>
+            </w:pPr>
+            <w:r>
+              <w:rPr>
+                <w:b w:val="1"/>
+                <w:bCs w:val="1"/>
+                <w:sz w:val="24"/>
+                <w:szCs w:val="24"/>
+                <w:rtl w:val="0"/>
+              </w:rPr>
+              <w:t xml:space="preserve">2a.</w:t>
+            </w:r>
+            <w:r>
+              <w:rPr>
+                <w:sz w:val="24"/>
+                <w:szCs w:val="24"/>
+                <w:rtl w:val="0"/>
+              </w:rPr>
+              <w:t xml:space="preserve"> A API de cálculo da transportadora não responde no tempo limite. </w:t>
+            </w:r>
+          </w:p>
+          <w:p>
+            <w:pPr>
+              <w:widowControl w:val="0"/>
+              <w:spacing w:line="240" w:lineRule="auto"/>
+              <w:ind w:left="720" w:firstLine="0"/>
+              <w:rPr>
+                <w:sz w:val="24"/>
+                <w:szCs w:val="24"/>
+              </w:rPr>
+            </w:pPr>
+            <w:r>
+              <w:rPr>
+                <w:rtl w:val="0"/>
+              </w:rPr>
+            </w:r>
+          </w:p>
+          <w:p>
+            <w:pPr>
+              <w:widowControl w:val="0"/>
+              <w:numPr>
+                <w:ilvl w:val="0"/>
+                <w:numId w:val="7"/>
+              </w:numPr>
+              <w:spacing w:line="240" w:lineRule="auto"/>
+              <w:ind w:left="720" w:hanging="360"/>
+              <w:rPr>
+                <w:sz w:val="24"/>
+                <w:szCs w:val="24"/>
+              </w:rPr>
+            </w:pPr>
+            <w:r>
+              <w:rPr>
+                <w:b w:val="1"/>
+                <w:bCs w:val="1"/>
+                <w:sz w:val="24"/>
+                <w:szCs w:val="24"/>
+                <w:rtl w:val="0"/>
+              </w:rPr>
+              <w:t xml:space="preserve">2b.</w:t>
+            </w:r>
+            <w:r>
+              <w:rPr>
+                <w:sz w:val="24"/>
+                <w:szCs w:val="24"/>
+                <w:rtl w:val="0"/>
+              </w:rPr>
+              <w:t xml:space="preserve"> O sistema utiliza a tabela de contingência offline de frete estimado e exibe aviso ao usuário. (Pode ter alteração no valor - Deve ser consultado posteriormente)</w:t>
+            </w:r>
+          </w:p>
+        </w:tc>
+      </w:tr>
+      <w:tr>
+        <w:trPr>
+          <w:cantSplit w:val="0"/>
+          <w:tblHeader w:val="0"/>
+        </w:trPr>
+        <w:tc>
+          <w:tcPr>
+            <w:shd w:fill="999999" w:val="clear"/>
+          </w:tcPr>
+          <w:p>
+            <w:pPr>
+              <w:widowControl w:val="0"/>
+              <w:spacing w:line="240" w:lineRule="auto"/>
+              <w:rPr>
+                <w:b w:val="1"/>
+                <w:bCs w:val="1"/>
+                <w:sz w:val="24"/>
+                <w:szCs w:val="24"/>
+              </w:rPr>
+            </w:pPr>
+            <w:r>
+              <w:rPr>
+                <w:b w:val="1"/>
+                <w:bCs w:val="1"/>
+                <w:sz w:val="24"/>
+                <w:szCs w:val="24"/>
+                <w:rtl w:val="0"/>
+              </w:rPr>
+              <w:t xml:space="preserve">Relações de Regras de Negócio: </w:t>
+            </w:r>
+          </w:p>
+        </w:tc>
+        <w:tc>
+          <w:tcPr/>
+          <w:p>
+            <w:pPr>
+              <w:widowControl w:val="0"/>
+              <w:numPr>
+                <w:ilvl w:val="0"/>
+                <w:numId w:val="1"/>
+              </w:numPr>
+              <w:spacing w:line="240" w:lineRule="auto"/>
+              <w:ind w:left="720" w:hanging="360"/>
+              <w:rPr>
+                <w:sz w:val="24"/>
+                <w:szCs w:val="24"/>
+              </w:rPr>
+            </w:pPr>
+            <w:r>
+              <w:rPr>
+                <w:b w:val="1"/>
+                <w:bCs w:val="1"/>
+                <w:sz w:val="24"/>
+                <w:szCs w:val="24"/>
+                <w:rtl w:val="0"/>
+              </w:rPr>
+              <w:t xml:space="preserve">RN01</w:t>
+            </w:r>
+            <w:r>
+              <w:rPr>
+                <w:sz w:val="24"/>
+                <w:szCs w:val="24"/>
+                <w:rtl w:val="0"/>
+              </w:rPr>
+              <w:t xml:space="preserve">  </w:t>
+            </w:r>
+            <w:r>
+              <w:rPr>
+                <w:rtl w:val="0"/>
+              </w:rPr>
+              <w:t xml:space="preserve"> - Valor total sempre inclui todos os gastos.</w:t>
+            </w:r>
+            <w:r>
+              <w:rPr>
+                <w:rtl w:val="0"/>
+              </w:rPr>
+            </w:r>
+          </w:p>
+          <w:p>
+            <w:pPr>
+              <w:widowControl w:val="0"/>
+              <w:spacing w:line="240" w:lineRule="auto"/>
+              <w:ind w:left="720" w:firstLine="0"/>
+              <w:rPr>
+                <w:sz w:val="24"/>
+                <w:szCs w:val="24"/>
+              </w:rPr>
+            </w:pPr>
+            <w:r>
+              <w:rPr>
+                <w:rtl w:val="0"/>
+              </w:rPr>
+            </w:r>
+          </w:p>
+          <w:p>
+            <w:pPr>
+              <w:widowControl w:val="0"/>
+              <w:numPr>
+                <w:ilvl w:val="0"/>
+                <w:numId w:val="1"/>
+              </w:numPr>
+              <w:spacing w:line="240" w:lineRule="auto"/>
+              <w:ind w:left="720" w:hanging="360"/>
+              <w:rPr>
+                <w:b w:val="1"/>
+                <w:bCs w:val="1"/>
+                <w:sz w:val="24"/>
+                <w:szCs w:val="24"/>
+              </w:rPr>
+            </w:pPr>
+            <w:r>
+              <w:rPr>
+                <w:b w:val="1"/>
+                <w:bCs w:val="1"/>
+                <w:sz w:val="24"/>
+                <w:szCs w:val="24"/>
+                <w:rtl w:val="0"/>
+              </w:rPr>
+              <w:t xml:space="preserve">RF02  </w:t>
+            </w:r>
+            <w:r>
+              <w:rPr>
+                <w:rtl w:val="0"/>
+              </w:rPr>
+              <w:t xml:space="preserve"> - Nota de localização deve ser entre 1 e 5.</w:t>
+            </w:r>
+            <w:r>
+              <w:rPr>
+                <w:rtl w:val="0"/>
+              </w:rPr>
+            </w:r>
+          </w:p>
+        </w:tc>
+      </w:tr>
+    </w:tbl>
+    <w:p>
+      <w:pPr>
+        <w:spacing w:line="360" w:lineRule="auto"/>
+        <w:jc w:val="both"/>
+        <w:rPr>
+          <w:sz w:val="24"/>
+          <w:szCs w:val="24"/>
+        </w:rPr>
+      </w:pPr>
+      <w:r>
+        <w:rPr>
+          <w:rtl w:val="0"/>
+        </w:rPr>
+      </w:r>
+    </w:p>
+    <w:p>
+      <w:pPr>
+        <w:rPr/>
+      </w:pPr>
+      <w:r>
+        <w:rPr>
+          <w:rtl w:val="0"/>
+        </w:rPr>
+      </w:r>
+    </w:p>
+    <w:p>
+      <w:pPr>
+        <w:rPr/>
+      </w:pPr>
+      <w:r>
+        <w:rPr>
+          <w:rtl w:val="0"/>
+        </w:rPr>
+      </w:r>
+    </w:p>
+    <w:p>
+      <w:pPr>
+        <w:rPr/>
+      </w:pPr>
+      <w:r>
+        <w:rPr>
+          <w:rtl w:val="0"/>
+        </w:rPr>
+      </w:r>
+    </w:p>
+    <w:p>
+      <w:pPr>
+        <w:rPr/>
+      </w:pPr>
+      <w:r>
+        <w:rPr>
+          <w:rtl w:val="0"/>
+        </w:rPr>
+      </w:r>
+    </w:p>
+    <w:p>
+      <w:pPr>
+        <w:rPr/>
+      </w:pPr>
+      <w:r>
+        <w:rPr>
+          <w:rtl w:val="0"/>
+        </w:rPr>
+      </w:r>
+    </w:p>
+    <w:p>
+      <w:pPr>
+        <w:rPr/>
+      </w:pPr>
+      <w:r>
+        <w:rPr>
+          <w:rtl w:val="0"/>
+        </w:rPr>
+      </w:r>
+    </w:p>
+    <w:p>
+      <w:pPr>
+        <w:rPr/>
+      </w:pPr>
+      <w:r>
+        <w:rPr>
+          <w:rtl w:val="0"/>
+        </w:rPr>
+      </w:r>
+    </w:p>
+    <w:p>
+      <w:pPr>
+        <w:rPr/>
+      </w:pPr>
+      <w:r>
+        <w:rPr>
+          <w:rtl w:val="0"/>
+        </w:rPr>
+      </w:r>
+    </w:p>
+    <w:p>
+      <w:pPr>
+        <w:rPr/>
+      </w:pPr>
+      <w:r>
+        <w:rPr>
+          <w:rtl w:val="0"/>
+        </w:rPr>
+      </w:r>
+    </w:p>
+    <w:p>
+      <w:pPr>
+        <w:rPr/>
+      </w:pPr>
+      <w:r>
+        <w:rPr>
+          <w:rtl w:val="0"/>
+        </w:rPr>
+      </w:r>
+    </w:p>
+    <w:p>
+      <w:pPr>
+        <w:rPr/>
+      </w:pPr>
+      <w:r>
+        <w:rPr>
+          <w:rtl w:val="0"/>
+        </w:rPr>
+      </w:r>
+    </w:p>
+    <w:p>
+      <w:pPr>
+        <w:rPr/>
+      </w:pPr>
+      <w:r>
+        <w:rPr>
+          <w:rtl w:val="0"/>
+        </w:rPr>
+      </w:r>
+    </w:p>
+    <w:p>
+      <w:pPr>
+        <w:rPr/>
+      </w:pPr>
+      <w:r>
+        <w:rPr>
+          <w:rtl w:val="0"/>
+        </w:rPr>
+      </w:r>
+    </w:p>
+    <w:p>
+      <w:pPr>
+        <w:rPr/>
+      </w:pPr>
+      <w:r>
+        <w:rPr>
+          <w:rtl w:val="0"/>
+        </w:rPr>
+      </w:r>
+    </w:p>
+    <w:p>
+      <w:pPr>
+        <w:rPr/>
+      </w:pPr>
+      <w:r>
+        <w:rPr>
+          <w:rtl w:val="0"/>
+        </w:rPr>
+      </w:r>
+    </w:p>
+    <w:p>
+      <w:pPr>
+        <w:rPr/>
+      </w:pPr>
+      <w:r>
+        <w:rPr>
+          <w:rtl w:val="0"/>
+        </w:rPr>
+      </w:r>
+    </w:p>
+    <w:p>
+      <w:pPr>
+        <w:rPr/>
+      </w:pPr>
+      <w:r>
+        <w:rPr>
+          <w:rtl w:val="0"/>
+        </w:rPr>
+      </w:r>
+    </w:p>
+    <w:p>
+      <w:pPr>
+        <w:rPr/>
+      </w:pPr>
+      <w:r>
+        <w:rPr>
+          <w:rtl w:val="0"/>
+        </w:rPr>
+      </w:r>
+    </w:p>
+    <w:p>
+      <w:pPr>
+        <w:rPr/>
+      </w:pPr>
+      <w:r>
+        <w:rPr>
+          <w:rtl w:val="0"/>
+        </w:rPr>
+      </w:r>
+    </w:p>
+    <w:p>
+      <w:pPr>
+        <w:rPr/>
+      </w:pPr>
+      <w:r>
+        <w:rPr>
+          <w:rtl w:val="0"/>
+        </w:rPr>
+      </w:r>
+    </w:p>
+    <w:p>
+      <w:pPr>
+        <w:rPr/>
+      </w:pPr>
+      <w:r>
+        <w:rPr>
+          <w:rtl w:val="0"/>
+        </w:rPr>
+      </w:r>
+    </w:p>
+    <w:p>
+      <w:pPr>
+        <w:rPr/>
+      </w:pPr>
+      <w:r>
+        <w:rPr>
+          <w:rtl w:val="0"/>
+        </w:rPr>
+      </w:r>
+    </w:p>
+    <w:p>
+      <w:pPr>
+        <w:rPr/>
+      </w:pPr>
+      <w:r>
+        <w:rPr>
+          <w:rtl w:val="0"/>
+        </w:rPr>
+      </w:r>
+    </w:p>
+    <w:p>
+      <w:pPr>
+        <w:rPr/>
+      </w:pPr>
+      <w:r>
+        <w:rPr>
+          <w:rtl w:val="0"/>
+        </w:rPr>
+      </w:r>
+    </w:p>
+    <w:p>
+      <w:pPr>
+        <w:rPr/>
+      </w:pPr>
+      <w:r>
+        <w:rPr>
+          <w:rtl w:val="0"/>
+        </w:rPr>
+      </w:r>
+    </w:p>
+    <w:p>
+      <w:pPr>
+        <w:rPr/>
+      </w:pPr>
+      <w:r>
+        <w:rPr>
+          <w:rtl w:val="0"/>
+        </w:rPr>
+      </w:r>
+    </w:p>
+    <w:p>
+      <w:pPr>
+        <w:rPr/>
+      </w:pPr>
+      <w:r>
+        <w:rPr>
+          <w:rtl w:val="0"/>
+        </w:rPr>
+      </w:r>
+    </w:p>
+    <w:p>
+      <w:pPr>
+        <w:rPr/>
+      </w:pPr>
+      <w:r>
+        <w:rPr>
+          <w:rtl w:val="0"/>
+        </w:rPr>
+      </w:r>
+    </w:p>
+    <w:p>
+      <w:pPr>
+        <w:spacing w:line="360" w:lineRule="auto"/>
+        <w:jc w:val="both"/>
+        <w:rPr>
+          <w:sz w:val="24"/>
+          <w:szCs w:val="24"/>
+        </w:rPr>
+      </w:pPr>
+      <w:r>
+        <w:rPr>
+          <w:rtl w:val="0"/>
+        </w:rPr>
+      </w:r>
+    </w:p>
+    <w:tbl>
+      <w:tblPr>
+        <w:tblStyle w:val="Table5"/>
+        <w:tblW w:w="14310.0" w:type="dxa"/>
+        <w:jc w:val="left"/>
+        <w:tblBorders>
+          <w:top w:color="000000" w:space="0" w:sz="8" w:val="single"/>
+          <w:left w:color="000000" w:space="0" w:sz="8" w:val="single"/>
+          <w:bottom w:color="000000" w:space="0" w:sz="8" w:val="single"/>
+          <w:right w:color="000000" w:space="0" w:sz="8" w:val="single"/>
+          <w:insideH w:color="000000" w:space="0" w:sz="8" w:val="single"/>
+          <w:insideV w:color="000000" w:space="0" w:sz="8" w:val="single"/>
+        </w:tblBorders>
+        <w:tblLayout w:type="fixed"/>
+        <w:tblLook w:val="0600"/>
+      </w:tblPr>
+      <w:tblGrid>
+        <w:gridCol w:w="1800"/>
+        <w:gridCol w:w="12510"/>
+        <w:tblGridChange w:id="0">
+          <w:tblGrid>
+            <w:gridCol w:w="1800"/>
+            <w:gridCol w:w="12510"/>
+          </w:tblGrid>
+        </w:tblGridChange>
+      </w:tblGrid>
+      <w:tr>
+        <w:trPr>
+          <w:cantSplit w:val="0"/>
+          <w:tblHeader w:val="0"/>
+        </w:trPr>
         <w:tc>
           <w:tcPr>
             <w:shd w:fill="999999" w:val="clear"/>
@@ -3963,12 +5242,6 @@
             </w:r>
           </w:p>
         </w:tc>
-      </w:tr>
-      <w:tr>
-        <w:trPr>
-          <w:cantSplit w:val="0"/>
-          <w:tblHeader w:val="0"/>
-        </w:trPr>
         <w:tc>
           <w:tcPr>
             <w:shd w:fill="999999" w:val="clear"/>
@@ -3993,13 +5266,43 @@
             </w:pPr>
             <w:r>
               <w:rPr>
-                <w:b w:val="1"/>
-                <w:bCs w:val="1"/>
-                <w:sz w:val="24"/>
-                <w:szCs w:val="24"/>
-                <w:rtl w:val="0"/>
-              </w:rPr>
-              <w:t xml:space="preserve">Ator Principal: </w:t>
+                <w:rtl w:val="0"/>
+              </w:rPr>
+            </w:r>
+          </w:p>
+        </w:tc>
+      </w:tr>
+      <w:tr>
+        <w:trPr>
+          <w:cantSplit w:val="0"/>
+          <w:tblHeader w:val="0"/>
+        </w:trPr>
+        <w:tc>
+          <w:tcPr>
+            <w:shd w:fill="999999" w:val="clear"/>
+            <w:tcMar>
+              <w:top w:w="100.0" w:type="dxa"/>
+              <w:left w:w="100.0" w:type="dxa"/>
+              <w:bottom w:w="100.0" w:type="dxa"/>
+              <w:right w:w="100.0" w:type="dxa"/>
+            </w:tcMar>
+            <w:vAlign w:val="top"/>
+          </w:tcPr>
+          <w:p>
+            <w:pPr>
+              <w:widowControl w:val="0"/>
+              <w:spacing w:line="240" w:lineRule="auto"/>
+              <w:rPr>
+                <w:b w:val="1"/>
+                <w:bCs w:val="1"/>
+                <w:sz w:val="24"/>
+                <w:szCs w:val="24"/>
+              </w:rPr>
+            </w:pPr>
+            <w:r>
+              <w:rPr>
+                <w:rtl w:val="0"/>
+              </w:rPr>
             </w:r>
           </w:p>
         </w:tc>
@@ -4016,17 +5319,6 @@
           </w:tcPr>
           <w:p>
             <w:pPr>
-              <w:rPr/>
-            </w:pPr>
-            <w:r>
-              <w:rPr>
-                <w:rtl w:val="0"/>
-              </w:rPr>
-              <w:t xml:space="preserve">Viajante Solo (Cliente)</w:t>
-            </w:r>
-          </w:p>
-          <w:p>
-            <w:pPr>
               <w:widowControl w:val="0"/>
               <w:spacing w:line="240" w:lineRule="auto"/>
               <w:rPr>
@@ -4071,13 +5363,8 @@
             </w:pPr>
             <w:r>
               <w:rPr>
-                <w:b w:val="1"/>
-                <w:bCs w:val="1"/>
-                <w:sz w:val="24"/>
-                <w:szCs w:val="24"/>
-                <w:rtl w:val="0"/>
-              </w:rPr>
-              <w:t xml:space="preserve">Resumo: </w:t>
+                <w:rtl w:val="0"/>
+              </w:rPr>
             </w:r>
           </w:p>
         </w:tc>
@@ -4094,27 +5381,6 @@
           </w:tcPr>
           <w:p>
             <w:pPr>
-              <w:rPr/>
-            </w:pPr>
-            <w:r>
-              <w:rPr>
-                <w:rtl w:val="0"/>
-              </w:rPr>
-              <w:t xml:space="preserve">O viajante pode dar nota aos locais (hotéis, museus, lanchonetes) que está visitando. Pode ver o horário de abertura, fechamento e faixa de preço. O sistema permite solicitar reembolso em caso de problemas e informa o valor total ao usuário.</w:t>
-            </w:r>
-          </w:p>
-          <w:p>
-            <w:pPr>
-              <w:rPr/>
-            </w:pPr>
-            <w:r>
-              <w:rPr>
-                <w:rtl w:val="0"/>
-              </w:rPr>
-            </w:r>
-          </w:p>
-          <w:p>
-            <w:pPr>
               <w:widowControl w:val="0"/>
               <w:spacing w:line="240" w:lineRule="auto"/>
               <w:rPr>
@@ -4159,13 +5425,8 @@
             </w:pPr>
             <w:r>
               <w:rPr>
-                <w:b w:val="1"/>
-                <w:bCs w:val="1"/>
-                <w:sz w:val="24"/>
-                <w:szCs w:val="24"/>
-                <w:rtl w:val="0"/>
-              </w:rPr>
-              <w:t xml:space="preserve">Pré-condições: </w:t>
+                <w:rtl w:val="0"/>
+              </w:rPr>
             </w:r>
           </w:p>
         </w:tc>
@@ -4182,30 +5443,7 @@
           </w:tcPr>
           <w:p>
             <w:pPr>
-              <w:rPr/>
-            </w:pPr>
-            <w:r>
-              <w:rPr>
-                <w:rtl w:val="0"/>
-              </w:rPr>
-              <w:t xml:space="preserve">- O usuário está logado.</w:t>
-            </w:r>
-          </w:p>
-          <w:p>
-            <w:pPr>
-              <w:rPr/>
-            </w:pPr>
-            <w:r>
-              <w:rPr>
-                <w:rtl w:val="0"/>
-              </w:rPr>
-              <w:t xml:space="preserve">- Tem uma viagem em andamento.</w:t>
-            </w:r>
-          </w:p>
-          <w:p>
-            <w:pPr>
-              <w:widowControl w:val="0"/>
-              <w:spacing w:line="240" w:lineRule="auto"/>
+              <w:ind w:left="720" w:firstLine="0"/>
               <w:rPr>
                 <w:sz w:val="24"/>
                 <w:szCs w:val="24"/>
@@ -4248,13 +5486,8 @@
             </w:pPr>
             <w:r>
               <w:rPr>
-                <w:b w:val="1"/>
-                <w:bCs w:val="1"/>
-                <w:sz w:val="24"/>
-                <w:szCs w:val="24"/>
-                <w:rtl w:val="0"/>
-              </w:rPr>
-              <w:t xml:space="preserve">Pós-condições: </w:t>
+                <w:rtl w:val="0"/>
+              </w:rPr>
             </w:r>
           </w:p>
         </w:tc>
@@ -4271,30 +5504,7 @@
           </w:tcPr>
           <w:p>
             <w:pPr>
-              <w:rPr/>
-            </w:pPr>
-            <w:r>
-              <w:rPr>
-                <w:rtl w:val="0"/>
-              </w:rPr>
-              <w:t xml:space="preserve">- O reembolso é solicitado e o valor total é calculado.</w:t>
-            </w:r>
-          </w:p>
-          <w:p>
-            <w:pPr>
-              <w:rPr/>
-            </w:pPr>
-            <w:r>
-              <w:rPr>
-                <w:rtl w:val="0"/>
-              </w:rPr>
-              <w:t xml:space="preserve">- A nota e as informações do local são salvos.</w:t>
-            </w:r>
-          </w:p>
-          <w:p>
-            <w:pPr>
-              <w:widowControl w:val="0"/>
-              <w:spacing w:line="240" w:lineRule="auto"/>
+              <w:ind w:left="720" w:firstLine="0"/>
               <w:rPr>
                 <w:sz w:val="24"/>
                 <w:szCs w:val="24"/>
@@ -4337,13 +5547,8 @@
             </w:pPr>
             <w:r>
               <w:rPr>
-                <w:b w:val="1"/>
-                <w:bCs w:val="1"/>
-                <w:sz w:val="24"/>
-                <w:szCs w:val="24"/>
-                <w:rtl w:val="0"/>
-              </w:rPr>
-              <w:t xml:space="preserve">Fluxo Principal: </w:t>
+                <w:rtl w:val="0"/>
+              </w:rPr>
             </w:r>
           </w:p>
         </w:tc>
@@ -4360,127 +5565,12 @@
           </w:tcPr>
           <w:p>
             <w:pPr>
-              <w:rPr/>
-            </w:pPr>
-            <w:r>
-              <w:rPr>
-                <w:rtl w:val="0"/>
-              </w:rPr>
-              <w:t xml:space="preserve">1. Durante a viagem, o usuário clica em "Problemas" no card do local.</w:t>
-            </w:r>
-          </w:p>
-          <w:p>
-            <w:pPr>
-              <w:rPr/>
-            </w:pPr>
-            <w:r>
-              <w:rPr>
-                <w:rtl w:val="0"/>
-              </w:rPr>
-              <w:t xml:space="preserve">2. Escolha o motivo do problema.</w:t>
-            </w:r>
-          </w:p>
-          <w:p>
-            <w:pPr>
-              <w:rPr/>
-            </w:pPr>
-            <w:r>
-              <w:rPr>
-                <w:rtl w:val="0"/>
-              </w:rPr>
-              <w:t xml:space="preserve">3. Enviar foto e descrição.</w:t>
-            </w:r>
-          </w:p>
-          <w:p>
-            <w:pPr>
-              <w:rPr/>
-            </w:pPr>
-            <w:r>
-              <w:rPr>
-                <w:rtl w:val="0"/>
-              </w:rPr>
-              <w:t xml:space="preserve">4. O sistema calcula o reembolso e mostra valor total.</w:t>
-            </w:r>
-          </w:p>
-          <w:p>
-            <w:pPr>
-              <w:rPr/>
-            </w:pPr>
-            <w:r>
-              <w:rPr>
-                <w:rtl w:val="0"/>
-              </w:rPr>
-              <w:t xml:space="preserve">5. Clica em "Solicitar".</w:t>
-            </w:r>
-          </w:p>
-          <w:p>
-            <w:pPr>
-              <w:rPr/>
-            </w:pPr>
-            <w:r>
-              <w:rPr>
-                <w:rtl w:val="0"/>
-              </w:rPr>
-              <w:t xml:space="preserve">6. O usuário acessa o cartão do local na viagem.</w:t>
-            </w:r>
-          </w:p>
-          <w:p>
-            <w:pPr>
-              <w:rPr/>
-            </w:pPr>
-            <w:r>
-              <w:rPr>
-                <w:rtl w:val="0"/>
-              </w:rPr>
-              <w:t xml:space="preserve">7. Clica em "Dar nota".</w:t>
-            </w:r>
-          </w:p>
-          <w:p>
-            <w:pPr>
-              <w:rPr/>
-            </w:pPr>
-            <w:r>
-              <w:rPr>
-                <w:rtl w:val="0"/>
-              </w:rPr>
-              <w:t xml:space="preserve">8. Escolhe nota de 1 a 5.</w:t>
-            </w:r>
-          </w:p>
-          <w:p>
-            <w:pPr>
-              <w:rPr/>
-            </w:pPr>
-            <w:r>
-              <w:rPr>
-                <w:rtl w:val="0"/>
-              </w:rPr>
-              <w:t xml:space="preserve">9. Clica em "Salvar".</w:t>
-            </w:r>
-          </w:p>
-          <w:p>
-            <w:pPr>
-              <w:rPr/>
-            </w:pPr>
-            <w:r>
-              <w:rPr>
-                <w:rtl w:val="0"/>
-              </w:rPr>
-              <w:t xml:space="preserve">10. O sistema mostra horário, fechamento e faixa de preço.</w:t>
-            </w:r>
-          </w:p>
-          <w:p>
-            <w:pPr>
-              <w:rPr/>
-            </w:pPr>
-            <w:r>
-              <w:rPr>
-                <w:rtl w:val="0"/>
-              </w:rPr>
-            </w:r>
-          </w:p>
-          <w:p>
-            <w:pPr>
-              <w:rPr/>
+              <w:widowControl w:val="0"/>
+              <w:spacing w:line="240" w:lineRule="auto"/>
+              <w:rPr>
+                <w:sz w:val="24"/>
+                <w:szCs w:val="24"/>
+              </w:rPr>
             </w:pPr>
             <w:r>
               <w:rPr>
@@ -4519,13 +5609,8 @@
             </w:pPr>
             <w:r>
               <w:rPr>
-                <w:b w:val="1"/>
-                <w:bCs w:val="1"/>
-                <w:sz w:val="24"/>
-                <w:szCs w:val="24"/>
-                <w:rtl w:val="0"/>
-              </w:rPr>
-              <w:t xml:space="preserve">Fluxos Alternativos: </w:t>
+                <w:rtl w:val="0"/>
+              </w:rPr>
             </w:r>
           </w:p>
         </w:tc>
@@ -4542,127 +5627,7 @@
           </w:tcPr>
           <w:p>
             <w:pPr>
-              <w:widowControl w:val="0"/>
-              <w:spacing w:line="240" w:lineRule="auto"/>
-              <w:rPr>
-                <w:b w:val="1"/>
-                <w:bCs w:val="1"/>
-                <w:sz w:val="24"/>
-                <w:szCs w:val="24"/>
-              </w:rPr>
-            </w:pPr>
-            <w:r>
-              <w:rPr>
-                <w:b w:val="1"/>
-                <w:bCs w:val="1"/>
-                <w:sz w:val="24"/>
-                <w:szCs w:val="24"/>
-                <w:rtl w:val="0"/>
-              </w:rPr>
-              <w:t xml:space="preserve">FA01 - Aplicação de Frete Grátis:</w:t>
-            </w:r>
-          </w:p>
-          <w:p>
-            <w:pPr>
-              <w:widowControl w:val="0"/>
-              <w:spacing w:line="240" w:lineRule="auto"/>
-              <w:rPr>
-                <w:sz w:val="24"/>
-                <w:szCs w:val="24"/>
-              </w:rPr>
-            </w:pPr>
-            <w:r>
-              <w:rPr>
-                <w:rtl w:val="0"/>
-              </w:rPr>
-            </w:r>
-          </w:p>
-          <w:p>
-            <w:pPr>
-              <w:widowControl w:val="0"/>
-              <w:numPr>
-                <w:ilvl w:val="0"/>
-                <w:numId w:val="2"/>
-              </w:numPr>
-              <w:spacing w:line="240" w:lineRule="auto"/>
-              <w:ind w:left="720" w:hanging="360"/>
-              <w:rPr>
-                <w:sz w:val="24"/>
-                <w:szCs w:val="24"/>
-              </w:rPr>
-            </w:pPr>
-            <w:r>
-              <w:rPr>
-                <w:b w:val="1"/>
-                <w:bCs w:val="1"/>
-                <w:sz w:val="24"/>
-                <w:szCs w:val="24"/>
-                <w:rtl w:val="0"/>
-              </w:rPr>
-              <w:t xml:space="preserve">3a.</w:t>
-            </w:r>
-            <w:r>
-              <w:rPr>
-                <w:sz w:val="24"/>
-                <w:szCs w:val="24"/>
-                <w:rtl w:val="0"/>
-              </w:rPr>
-              <w:t xml:space="preserve"> O sistema identifica que o CEP pertence à mesma região metropolitana do CD ou que o cliente é membro ativo do programa de fidelidade. </w:t>
-            </w:r>
-          </w:p>
-          <w:p>
-            <w:pPr>
-              <w:widowControl w:val="0"/>
-              <w:spacing w:line="240" w:lineRule="auto"/>
-              <w:ind w:left="720" w:firstLine="0"/>
-              <w:rPr>
-                <w:sz w:val="24"/>
-                <w:szCs w:val="24"/>
-              </w:rPr>
-            </w:pPr>
-            <w:r>
-              <w:rPr>
-                <w:rtl w:val="0"/>
-              </w:rPr>
-            </w:r>
-          </w:p>
-          <w:p>
-            <w:pPr>
-              <w:widowControl w:val="0"/>
-              <w:numPr>
-                <w:ilvl w:val="0"/>
-                <w:numId w:val="2"/>
-              </w:numPr>
-              <w:spacing w:line="240" w:lineRule="auto"/>
-              <w:ind w:left="720" w:hanging="360"/>
-              <w:rPr>
-                <w:sz w:val="24"/>
-                <w:szCs w:val="24"/>
-              </w:rPr>
-            </w:pPr>
-            <w:r>
-              <w:rPr>
-                <w:b w:val="1"/>
-                <w:bCs w:val="1"/>
-                <w:sz w:val="24"/>
-                <w:szCs w:val="24"/>
-                <w:rtl w:val="0"/>
-              </w:rPr>
-              <w:t xml:space="preserve">3b.</w:t>
-            </w:r>
-            <w:r>
-              <w:rPr>
-                <w:sz w:val="24"/>
-                <w:szCs w:val="24"/>
-                <w:rtl w:val="0"/>
-              </w:rPr>
-              <w:t xml:space="preserve"> O sistema aplica isenção total de frete (R$0,00) ao carrinho. </w:t>
-            </w:r>
-          </w:p>
-          <w:p>
-            <w:pPr>
-              <w:widowControl w:val="0"/>
-              <w:spacing w:line="240" w:lineRule="auto"/>
+              <w:ind w:left="0" w:firstLine="0"/>
               <w:rPr>
                 <w:sz w:val="24"/>
                 <w:szCs w:val="24"/>
@@ -4728,121 +5693,881 @@
           </w:tcPr>
           <w:p>
             <w:pPr>
-              <w:widowControl w:val="0"/>
-              <w:spacing w:line="240" w:lineRule="auto"/>
-              <w:rPr>
-                <w:b w:val="1"/>
-                <w:bCs w:val="1"/>
-                <w:sz w:val="24"/>
-                <w:szCs w:val="24"/>
-              </w:rPr>
-            </w:pPr>
-            <w:r>
-              <w:rPr>
-                <w:b w:val="1"/>
-                <w:bCs w:val="1"/>
-                <w:sz w:val="24"/>
-                <w:szCs w:val="24"/>
-                <w:rtl w:val="0"/>
-              </w:rPr>
-              <w:t xml:space="preserve">FE01 - Indisponibilidade na API da Transportadora:</w:t>
-            </w:r>
-          </w:p>
-          <w:p>
-            <w:pPr>
-              <w:widowControl w:val="0"/>
-              <w:spacing w:line="240" w:lineRule="auto"/>
-              <w:rPr>
-                <w:sz w:val="24"/>
-                <w:szCs w:val="24"/>
-              </w:rPr>
-            </w:pPr>
-            <w:r>
-              <w:rPr>
-                <w:rtl w:val="0"/>
-              </w:rPr>
-            </w:r>
-          </w:p>
-          <w:p>
-            <w:pPr>
-              <w:widowControl w:val="0"/>
-              <w:numPr>
-                <w:ilvl w:val="0"/>
-                <w:numId w:val="3"/>
-              </w:numPr>
-              <w:spacing w:line="240" w:lineRule="auto"/>
-              <w:ind w:left="720" w:hanging="360"/>
-              <w:rPr>
-                <w:sz w:val="24"/>
-                <w:szCs w:val="24"/>
-              </w:rPr>
-            </w:pPr>
-            <w:r>
-              <w:rPr>
-                <w:b w:val="1"/>
-                <w:bCs w:val="1"/>
-                <w:sz w:val="24"/>
-                <w:szCs w:val="24"/>
-                <w:rtl w:val="0"/>
-              </w:rPr>
-              <w:t xml:space="preserve">2a.</w:t>
-            </w:r>
-            <w:r>
-              <w:rPr>
-                <w:sz w:val="24"/>
-                <w:szCs w:val="24"/>
-                <w:rtl w:val="0"/>
-              </w:rPr>
-              <w:t xml:space="preserve"> A API de cálculo da transportadora não responde no tempo limite. </w:t>
-            </w:r>
-          </w:p>
-          <w:p>
-            <w:pPr>
-              <w:widowControl w:val="0"/>
-              <w:spacing w:line="240" w:lineRule="auto"/>
-              <w:ind w:left="720" w:firstLine="0"/>
-              <w:rPr>
-                <w:sz w:val="24"/>
-                <w:szCs w:val="24"/>
-              </w:rPr>
-            </w:pPr>
-            <w:r>
-              <w:rPr>
-                <w:rtl w:val="0"/>
-              </w:rPr>
-            </w:r>
-          </w:p>
-          <w:p>
-            <w:pPr>
-              <w:widowControl w:val="0"/>
-              <w:numPr>
-                <w:ilvl w:val="0"/>
-                <w:numId w:val="3"/>
-              </w:numPr>
-              <w:spacing w:line="240" w:lineRule="auto"/>
-              <w:ind w:left="720" w:hanging="360"/>
-              <w:rPr>
-                <w:sz w:val="24"/>
-                <w:szCs w:val="24"/>
-              </w:rPr>
-            </w:pPr>
-            <w:r>
-              <w:rPr>
-                <w:b w:val="1"/>
-                <w:bCs w:val="1"/>
-                <w:sz w:val="24"/>
-                <w:szCs w:val="24"/>
-                <w:rtl w:val="0"/>
-              </w:rPr>
-              <w:t xml:space="preserve">2b.</w:t>
-            </w:r>
-            <w:r>
-              <w:rPr>
-                <w:sz w:val="24"/>
-                <w:szCs w:val="24"/>
-                <w:rtl w:val="0"/>
-              </w:rPr>
-              <w:t xml:space="preserve"> O sistema utiliza a tabela de contingência offline de frete estimado e exibe aviso ao usuário. (Pode ter alteração no valor - Deve ser consultado posteriormente)</w:t>
+              <w:rPr/>
+            </w:pPr>
+            <w:r>
+              <w:rPr>
+                <w:rtl w:val="0"/>
+              </w:rPr>
+              <w:t xml:space="preserve">- FE01 - Falha na API de localização: exibe erro "Verifique sua conexão".</w:t>
+            </w:r>
+          </w:p>
+          <w:p>
+            <w:pPr>
+              <w:rPr>
+                <w:sz w:val="24"/>
+                <w:szCs w:val="24"/>
+              </w:rPr>
+            </w:pPr>
+            <w:r>
+              <w:rPr>
+                <w:rtl w:val="0"/>
+              </w:rPr>
+              <w:t xml:space="preserve">  FE02 - Falha no servidor: exibe erro "Tente n</w:t>
+            </w:r>
+            <w:r>
+              <w:rPr>
+                <w:rtl w:val="0"/>
+              </w:rPr>
+            </w:r>
+          </w:p>
+          <w:tbl>
+            <w:tblPr>
+              <w:tblStyle w:val="Table6"/>
+              <w:tblW w:w="14310.0" w:type="dxa"/>
+              <w:jc w:val="left"/>
+              <w:tblBorders>
+                <w:top w:color="000000" w:space="0" w:sz="8" w:val="single"/>
+                <w:left w:color="000000" w:space="0" w:sz="8" w:val="single"/>
+                <w:bottom w:color="000000" w:space="0" w:sz="8" w:val="single"/>
+                <w:right w:color="000000" w:space="0" w:sz="8" w:val="single"/>
+                <w:insideH w:color="000000" w:space="0" w:sz="8" w:val="single"/>
+                <w:insideV w:color="000000" w:space="0" w:sz="8" w:val="single"/>
+              </w:tblBorders>
+              <w:tblLayout w:type="fixed"/>
+              <w:tblLook w:val="0600"/>
+            </w:tblPr>
+            <w:tblGrid>
+              <w:gridCol w:w="1800"/>
+              <w:gridCol w:w="12510"/>
+              <w:tblGridChange w:id="0">
+                <w:tblGrid>
+                  <w:gridCol w:w="1800"/>
+                  <w:gridCol w:w="12510"/>
+                </w:tblGrid>
+              </w:tblGridChange>
+            </w:tblGrid>
+            <w:tr>
+              <w:trPr>
+                <w:cantSplit w:val="0"/>
+                <w:tblHeader w:val="0"/>
+              </w:trPr>
+              <w:tc>
+                <w:tcPr>
+                  <w:shd w:fill="999999" w:val="clear"/>
+                </w:tcPr>
+                <w:p>
+                  <w:pPr>
+                    <w:spacing w:line="240" w:lineRule="auto"/>
+                    <w:rPr>
+                      <w:b w:val="1"/>
+                      <w:bCs w:val="1"/>
+                      <w:sz w:val="24"/>
+                      <w:szCs w:val="24"/>
+                    </w:rPr>
+                  </w:pPr>
+                  <w:r>
+                    <w:rPr>
+                      <w:b w:val="1"/>
+                      <w:bCs w:val="1"/>
+                      <w:sz w:val="24"/>
+                      <w:szCs w:val="24"/>
+                      <w:rtl w:val="0"/>
+                    </w:rPr>
+                    <w:t xml:space="preserve">CASO DE USO EXPANDIDO - 001</w:t>
+                  </w:r>
+                </w:p>
+              </w:tc>
+              <w:tc>
+                <w:tcPr>
+                  <w:shd w:fill="999999" w:val="clear"/>
+                </w:tcPr>
+                <w:p>
+                  <w:pPr>
+                    <w:spacing w:line="240" w:lineRule="auto"/>
+                    <w:rPr>
+                      <w:b w:val="1"/>
+                      <w:bCs w:val="1"/>
+                      <w:sz w:val="24"/>
+                      <w:szCs w:val="24"/>
+                    </w:rPr>
+                  </w:pPr>
+                  <w:r>
+                    <w:rPr>
+                      <w:b w:val="1"/>
+                      <w:bCs w:val="1"/>
+                      <w:sz w:val="24"/>
+                      <w:szCs w:val="24"/>
+                      <w:rtl w:val="0"/>
+                    </w:rPr>
+                    <w:t xml:space="preserve">emanuel carvalho n : 13</w:t>
+                  </w:r>
+                </w:p>
+              </w:tc>
+            </w:tr>
+            <w:tr>
+              <w:trPr>
+                <w:cantSplit w:val="0"/>
+                <w:tblHeader w:val="0"/>
+              </w:trPr>
+              <w:tc>
+                <w:tcPr>
+                  <w:shd w:fill="999999" w:val="clear"/>
+                </w:tcPr>
+                <w:p>
+                  <w:pPr>
+                    <w:spacing w:line="240" w:lineRule="auto"/>
+                    <w:rPr>
+                      <w:b w:val="1"/>
+                      <w:bCs w:val="1"/>
+                      <w:sz w:val="24"/>
+                      <w:szCs w:val="24"/>
+                    </w:rPr>
+                  </w:pPr>
+                  <w:r>
+                    <w:rPr>
+                      <w:b w:val="1"/>
+                      <w:bCs w:val="1"/>
+                      <w:sz w:val="24"/>
+                      <w:szCs w:val="24"/>
+                      <w:rtl w:val="0"/>
+                    </w:rPr>
+                    <w:t xml:space="preserve">Ator Principal: </w:t>
+                  </w:r>
+                </w:p>
+              </w:tc>
+              <w:tc>
+                <w:tcPr/>
+                <w:p>
+                  <w:pPr>
+                    <w:rPr/>
+                  </w:pPr>
+                  <w:r>
+                    <w:rPr>
+                      <w:rtl w:val="0"/>
+                    </w:rPr>
+                    <w:t xml:space="preserve">Viajante Solo (Cliente)</w:t>
+                  </w:r>
+                </w:p>
+                <w:p>
+                  <w:pPr>
+                    <w:spacing w:line="240" w:lineRule="auto"/>
+                    <w:rPr>
+                      <w:sz w:val="24"/>
+                      <w:szCs w:val="24"/>
+                    </w:rPr>
+                  </w:pPr>
+                  <w:r>
+                    <w:rPr>
+                      <w:rtl w:val="0"/>
+                    </w:rPr>
+                  </w:r>
+                </w:p>
+              </w:tc>
+            </w:tr>
+            <w:tr>
+              <w:trPr>
+                <w:cantSplit w:val="0"/>
+                <w:tblHeader w:val="0"/>
+              </w:trPr>
+              <w:tc>
+                <w:tcPr>
+                  <w:shd w:fill="999999" w:val="clear"/>
+                </w:tcPr>
+                <w:p>
+                  <w:pPr>
+                    <w:spacing w:line="240" w:lineRule="auto"/>
+                    <w:rPr>
+                      <w:b w:val="1"/>
+                      <w:bCs w:val="1"/>
+                      <w:sz w:val="24"/>
+                      <w:szCs w:val="24"/>
+                    </w:rPr>
+                  </w:pPr>
+                  <w:r>
+                    <w:rPr>
+                      <w:b w:val="1"/>
+                      <w:bCs w:val="1"/>
+                      <w:sz w:val="24"/>
+                      <w:szCs w:val="24"/>
+                      <w:rtl w:val="0"/>
+                    </w:rPr>
+                    <w:t xml:space="preserve">Resumo: </w:t>
+                  </w:r>
+                </w:p>
+              </w:tc>
+              <w:tc>
+                <w:tcPr/>
+                <w:p>
+                  <w:pPr>
+                    <w:rPr/>
+                  </w:pPr>
+                  <w:r>
+                    <w:rPr>
+                      <w:rtl w:val="0"/>
+                    </w:rPr>
+                    <w:t xml:space="preserve"> O usuário realiza o cadastro e autenticação na plataforma para criar sua conta, configurando seu perfil de gastos. O sistema valida automaticamente a idade (maiores de 18 anos) e libera a criação de viagens independentes. O sistema permite cadastro e login com nome, e-mail e senha. O usuário pode criar, editar ou cancelar viagem. O viajante registra gastos em categorias como transporte, hospedagem, alimentação e passeios. O sistema calcula automaticamente o custo por categoria e o total da viagem. O sistema permite escolher o tipo de viagem (lazer ou negócios).</w:t>
+                  </w:r>
+                </w:p>
+                <w:p>
+                  <w:pPr>
+                    <w:spacing w:line="240" w:lineRule="auto"/>
+                    <w:rPr>
+                      <w:sz w:val="24"/>
+                      <w:szCs w:val="24"/>
+                    </w:rPr>
+                  </w:pPr>
+                  <w:r>
+                    <w:rPr>
+                      <w:rtl w:val="0"/>
+                    </w:rPr>
+                  </w:r>
+                </w:p>
+              </w:tc>
+            </w:tr>
+            <w:tr>
+              <w:trPr>
+                <w:cantSplit w:val="0"/>
+                <w:tblHeader w:val="0"/>
+              </w:trPr>
+              <w:tc>
+                <w:tcPr>
+                  <w:shd w:fill="999999" w:val="clear"/>
+                </w:tcPr>
+                <w:p>
+                  <w:pPr>
+                    <w:spacing w:line="240" w:lineRule="auto"/>
+                    <w:rPr>
+                      <w:b w:val="1"/>
+                      <w:bCs w:val="1"/>
+                      <w:sz w:val="24"/>
+                      <w:szCs w:val="24"/>
+                    </w:rPr>
+                  </w:pPr>
+                  <w:r>
+                    <w:rPr>
+                      <w:b w:val="1"/>
+                      <w:bCs w:val="1"/>
+                      <w:sz w:val="24"/>
+                      <w:szCs w:val="24"/>
+                      <w:rtl w:val="0"/>
+                    </w:rPr>
+                    <w:t xml:space="preserve">Pré-condições: </w:t>
+                  </w:r>
+                </w:p>
+              </w:tc>
+              <w:tc>
+                <w:tcPr/>
+                <w:p>
+                  <w:pPr>
+                    <w:numPr>
+                      <w:ilvl w:val="0"/>
+                      <w:numId w:val="6"/>
+                    </w:numPr>
+                    <w:ind w:left="720" w:hanging="360"/>
+                  </w:pPr>
+                  <w:r>
+                    <w:rPr>
+                      <w:rtl w:val="0"/>
+                    </w:rPr>
+                    <w:t xml:space="preserve"> O usuário acessou a tela de registro e está logado.</w:t>
+                  </w:r>
+                </w:p>
+                <w:p>
+                  <w:pPr>
+                    <w:numPr>
+                      <w:ilvl w:val="0"/>
+                      <w:numId w:val="6"/>
+                    </w:numPr>
+                    <w:ind w:left="720" w:hanging="360"/>
+                  </w:pPr>
+                  <w:r>
+                    <w:rPr>
+                      <w:rtl w:val="0"/>
+                    </w:rPr>
+                    <w:t xml:space="preserve"> O e-mail e senha são informados corretamente.</w:t>
+                  </w:r>
+                </w:p>
+                <w:p>
+                  <w:pPr>
+                    <w:numPr>
+                      <w:ilvl w:val="0"/>
+                      <w:numId w:val="6"/>
+                    </w:numPr>
+                    <w:ind w:left="720" w:hanging="360"/>
+                  </w:pPr>
+                  <w:r>
+                    <w:rPr>
+                      <w:rtl w:val="0"/>
+                    </w:rPr>
+                    <w:t xml:space="preserve">A data de nascimento está cadastrada.</w:t>
+                  </w:r>
+                </w:p>
+                <w:p>
+                  <w:pPr>
+                    <w:numPr>
+                      <w:ilvl w:val="0"/>
+                      <w:numId w:val="6"/>
+                    </w:numPr>
+                    <w:ind w:left="720" w:hanging="360"/>
+                  </w:pPr>
+                  <w:r>
+                    <w:rPr>
+                      <w:rtl w:val="0"/>
+                    </w:rPr>
+                    <w:t xml:space="preserve">O usuário acessou a tela de criação de viagem e tem uma viagem selecionada.</w:t>
+                  </w:r>
+                </w:p>
+                <w:p>
+                  <w:pPr>
+                    <w:numPr>
+                      <w:ilvl w:val="0"/>
+                      <w:numId w:val="6"/>
+                    </w:numPr>
+                    <w:ind w:left="720" w:hanging="360"/>
+                  </w:pPr>
+                  <w:r>
+                    <w:rPr>
+                      <w:rtl w:val="0"/>
+                    </w:rPr>
+                    <w:t xml:space="preserve">O usuário acessou a aba "Gastos" ou "Configurações"</w:t>
+                  </w:r>
+                  <w:r>
+                    <w:rPr>
+                      <w:rtl w:val="0"/>
+                    </w:rPr>
+                  </w:r>
+                </w:p>
+              </w:tc>
+            </w:tr>
+            <w:tr>
+              <w:trPr>
+                <w:cantSplit w:val="0"/>
+                <w:tblHeader w:val="0"/>
+              </w:trPr>
+              <w:tc>
+                <w:tcPr>
+                  <w:shd w:fill="999999" w:val="clear"/>
+                </w:tcPr>
+                <w:p>
+                  <w:pPr>
+                    <w:spacing w:line="240" w:lineRule="auto"/>
+                    <w:rPr>
+                      <w:b w:val="1"/>
+                      <w:bCs w:val="1"/>
+                      <w:sz w:val="24"/>
+                      <w:szCs w:val="24"/>
+                    </w:rPr>
+                  </w:pPr>
+                  <w:r>
+                    <w:rPr>
+                      <w:b w:val="1"/>
+                      <w:bCs w:val="1"/>
+                      <w:sz w:val="24"/>
+                      <w:szCs w:val="24"/>
+                      <w:rtl w:val="0"/>
+                    </w:rPr>
+                    <w:t xml:space="preserve">Pós-condições: </w:t>
+                  </w:r>
+                </w:p>
+              </w:tc>
+              <w:tc>
+                <w:tcPr/>
+                <w:p>
+                  <w:pPr>
+                    <w:numPr>
+                      <w:ilvl w:val="0"/>
+                      <w:numId w:val="5"/>
+                    </w:numPr>
+                    <w:ind w:left="720" w:hanging="360"/>
+                    <w:rPr>
+                      <w:sz w:val="24"/>
+                      <w:szCs w:val="24"/>
+                    </w:rPr>
+                  </w:pPr>
+                  <w:r>
+                    <w:rPr>
+                      <w:rtl w:val="0"/>
+                    </w:rPr>
+                    <w:t xml:space="preserve"> A conta é criada e ativada com sucesso.</w:t>
+                  </w:r>
+                </w:p>
+                <w:p>
+                  <w:pPr>
+                    <w:numPr>
+                      <w:ilvl w:val="0"/>
+                      <w:numId w:val="5"/>
+                    </w:numPr>
+                    <w:ind w:left="720" w:hanging="360"/>
+                    <w:rPr>
+                      <w:sz w:val="24"/>
+                      <w:szCs w:val="24"/>
+                    </w:rPr>
+                  </w:pPr>
+                  <w:r>
+                    <w:rPr>
+                      <w:rtl w:val="0"/>
+                    </w:rPr>
+                    <w:t xml:space="preserve"> A viagem é criada, editada ou cancelada com sucesso.</w:t>
+                  </w:r>
+                </w:p>
+                <w:p>
+                  <w:pPr>
+                    <w:numPr>
+                      <w:ilvl w:val="0"/>
+                      <w:numId w:val="5"/>
+                    </w:numPr>
+                    <w:ind w:left="720" w:hanging="360"/>
+                    <w:rPr>
+                      <w:sz w:val="24"/>
+                      <w:szCs w:val="24"/>
+                    </w:rPr>
+                  </w:pPr>
+                  <w:r>
+                    <w:rPr>
+                      <w:rtl w:val="0"/>
+                    </w:rPr>
+                    <w:t xml:space="preserve"> Os gastos são salvos com categoria e total calculado.</w:t>
+                  </w:r>
+                </w:p>
+                <w:p>
+                  <w:pPr>
+                    <w:numPr>
+                      <w:ilvl w:val="0"/>
+                      <w:numId w:val="5"/>
+                    </w:numPr>
+                    <w:ind w:left="720" w:hanging="360"/>
+                    <w:rPr>
+                      <w:sz w:val="24"/>
+                      <w:szCs w:val="24"/>
+                    </w:rPr>
+                  </w:pPr>
+                  <w:r>
+                    <w:rPr>
+                      <w:rtl w:val="0"/>
+                    </w:rPr>
+                    <w:t xml:space="preserve"> O tipo de viagem é salvo e usado para gerar bagagem e sugestões.</w:t>
+                  </w:r>
+                </w:p>
+                <w:p>
+                  <w:pPr>
+                    <w:numPr>
+                      <w:ilvl w:val="0"/>
+                      <w:numId w:val="5"/>
+                    </w:numPr>
+                    <w:ind w:left="720" w:hanging="360"/>
+                    <w:rPr>
+                      <w:sz w:val="24"/>
+                      <w:szCs w:val="24"/>
+                    </w:rPr>
+                  </w:pPr>
+                  <w:r>
+                    <w:rPr>
+                      <w:rtl w:val="0"/>
+                    </w:rPr>
+                    <w:t xml:space="preserve">As configurações de perfil (incluindo idade) são persistidas e acessíveis.</w:t>
+                  </w:r>
+                </w:p>
+                <w:p>
+                  <w:pPr>
+                    <w:ind w:left="720" w:firstLine="0"/>
+                    <w:rPr>
+                      <w:sz w:val="24"/>
+                      <w:szCs w:val="24"/>
+                    </w:rPr>
+                  </w:pPr>
+                  <w:r>
+                    <w:rPr>
+                      <w:rtl w:val="0"/>
+                    </w:rPr>
+                  </w:r>
+                </w:p>
+              </w:tc>
+            </w:tr>
+            <w:tr>
+              <w:trPr>
+                <w:cantSplit w:val="0"/>
+                <w:tblHeader w:val="0"/>
+              </w:trPr>
+              <w:tc>
+                <w:tcPr>
+                  <w:shd w:fill="999999" w:val="clear"/>
+                </w:tcPr>
+                <w:p>
+                  <w:pPr>
+                    <w:spacing w:line="240" w:lineRule="auto"/>
+                    <w:rPr>
+                      <w:b w:val="1"/>
+                      <w:bCs w:val="1"/>
+                      <w:sz w:val="24"/>
+                      <w:szCs w:val="24"/>
+                    </w:rPr>
+                  </w:pPr>
+                  <w:r>
+                    <w:rPr>
+                      <w:b w:val="1"/>
+                      <w:bCs w:val="1"/>
+                      <w:sz w:val="24"/>
+                      <w:szCs w:val="24"/>
+                      <w:rtl w:val="0"/>
+                    </w:rPr>
+                    <w:t xml:space="preserve">Fluxo Principal: </w:t>
+                  </w:r>
+                </w:p>
+              </w:tc>
+              <w:tc>
+                <w:tcPr/>
+                <w:p>
+                  <w:pPr>
+                    <w:rPr/>
+                  </w:pPr>
+                  <w:r>
+                    <w:rPr>
+                      <w:rtl w:val="0"/>
+                    </w:rPr>
+                    <w:t xml:space="preserve">1. O usuário preenche os dados de cadastro: nome completo, e-mail válido e senha forte.</w:t>
+                  </w:r>
+                </w:p>
+                <w:p>
+                  <w:pPr>
+                    <w:rPr/>
+                  </w:pPr>
+                  <w:r>
+                    <w:rPr>
+                      <w:rtl w:val="0"/>
+                    </w:rPr>
+                    <w:t xml:space="preserve">2. O sistema realiza o registro e armazena o usuário no banco de dados.</w:t>
+                  </w:r>
+                </w:p>
+                <w:p>
+                  <w:pPr>
+                    <w:rPr/>
+                  </w:pPr>
+                  <w:r>
+                    <w:rPr>
+                      <w:rtl w:val="0"/>
+                    </w:rPr>
+                    <w:t xml:space="preserve">3. O sistema valida a data de nascimento e verifica se o usuário tem 18 anos ou mais.</w:t>
+                  </w:r>
+                </w:p>
+                <w:p>
+                  <w:pPr>
+                    <w:rPr/>
+                  </w:pPr>
+                  <w:r>
+                    <w:rPr>
+                      <w:rtl w:val="0"/>
+                    </w:rPr>
+                    <w:t xml:space="preserve">4. Se a idade for válida, exibe mensagem de sucesso e permite login direto.</w:t>
+                  </w:r>
+                </w:p>
+                <w:p>
+                  <w:pPr>
+                    <w:rPr/>
+                  </w:pPr>
+                  <w:r>
+                    <w:rPr>
+                      <w:rtl w:val="0"/>
+                    </w:rPr>
+                    <w:t xml:space="preserve">5. Caso a idade seja inferior a 18 anos, exibe alerta e bloqueia o acesso à criação de viagens.</w:t>
+                  </w:r>
+                </w:p>
+                <w:p>
+                  <w:pPr>
+                    <w:rPr/>
+                  </w:pPr>
+                  <w:r>
+                    <w:rPr>
+                      <w:rtl w:val="0"/>
+                    </w:rPr>
+                    <w:t xml:space="preserve">6. O usuário acessa a tela de "Minhas Viagens" e clica em "+" para criar uma nova viagem.</w:t>
+                  </w:r>
+                </w:p>
+                <w:p>
+                  <w:pPr>
+                    <w:rPr/>
+                  </w:pPr>
+                  <w:r>
+                    <w:rPr>
+                      <w:rtl w:val="0"/>
+                    </w:rPr>
+                    <w:t xml:space="preserve">7. Preenche os dados obrigatórios (destino, datas, orçamento etc.).</w:t>
+                  </w:r>
+                </w:p>
+                <w:p>
+                  <w:pPr>
+                    <w:rPr/>
+                  </w:pPr>
+                  <w:r>
+                    <w:rPr>
+                      <w:rtl w:val="0"/>
+                    </w:rPr>
+                    <w:t xml:space="preserve">8. Clica em "Salvar".</w:t>
+                  </w:r>
+                </w:p>
+                <w:p>
+                  <w:pPr>
+                    <w:rPr/>
+                  </w:pPr>
+                  <w:r>
+                    <w:rPr>
+                      <w:rtl w:val="0"/>
+                    </w:rPr>
+                    <w:t xml:space="preserve">9. O sistema valida os dados e os salva no banco.</w:t>
+                  </w:r>
+                </w:p>
+                <w:p>
+                  <w:pPr>
+                    <w:rPr/>
+                  </w:pPr>
+                  <w:r>
+                    <w:rPr>
+                      <w:rtl w:val="0"/>
+                    </w:rPr>
+                    <w:t xml:space="preserve">10. Exibe mensagem de sucesso e redireciona para a lista de viagens.</w:t>
+                  </w:r>
+                </w:p>
+                <w:p>
+                  <w:pPr>
+                    <w:rPr/>
+                  </w:pPr>
+                  <w:r>
+                    <w:rPr>
+                      <w:rtl w:val="0"/>
+                    </w:rPr>
+                    <w:t xml:space="preserve">11. O usuário acessa a aba "Gastos".</w:t>
+                  </w:r>
+                </w:p>
+                <w:p>
+                  <w:pPr>
+                    <w:rPr/>
+                  </w:pPr>
+                  <w:r>
+                    <w:rPr>
+                      <w:rtl w:val="0"/>
+                    </w:rPr>
+                    <w:t xml:space="preserve">12. Clica em "Adicionar gasto".</w:t>
+                  </w:r>
+                </w:p>
+                <w:p>
+                  <w:pPr>
+                    <w:rPr/>
+                  </w:pPr>
+                  <w:r>
+                    <w:rPr>
+                      <w:rtl w:val="0"/>
+                    </w:rPr>
+                    <w:t xml:space="preserve">13. Escolher categoria (transporte, hospedagem etc.).</w:t>
+                  </w:r>
+                </w:p>
+                <w:p>
+                  <w:pPr>
+                    <w:rPr/>
+                  </w:pPr>
+                  <w:r>
+                    <w:rPr>
+                      <w:rtl w:val="0"/>
+                    </w:rPr>
+                    <w:t xml:space="preserve">14. Informa valor, data e descrição.</w:t>
+                  </w:r>
+                </w:p>
+                <w:p>
+                  <w:pPr>
+                    <w:rPr/>
+                  </w:pPr>
+                  <w:r>
+                    <w:rPr>
+                      <w:rtl w:val="0"/>
+                    </w:rPr>
+                    <w:t xml:space="preserve">15. Clica em "Salvar".</w:t>
+                  </w:r>
+                </w:p>
+                <w:p>
+                  <w:pPr>
+                    <w:rPr/>
+                  </w:pPr>
+                  <w:r>
+                    <w:rPr>
+                      <w:rtl w:val="0"/>
+                    </w:rPr>
+                    <w:t xml:space="preserve">16. O sistema atualiza o total da viagem.</w:t>
+                  </w:r>
+                </w:p>
+                <w:p>
+                  <w:pPr>
+                    <w:rPr/>
+                  </w:pPr>
+                  <w:r>
+                    <w:rPr>
+                      <w:rtl w:val="0"/>
+                    </w:rPr>
+                    <w:t xml:space="preserve">17. O usuário acessa a aba "Configurações da viagem".</w:t>
+                  </w:r>
+                </w:p>
+                <w:p>
+                  <w:pPr>
+                    <w:rPr/>
+                  </w:pPr>
+                  <w:r>
+                    <w:rPr>
+                      <w:rtl w:val="0"/>
+                    </w:rPr>
+                    <w:t xml:space="preserve">18. Escolha "Lazer" ou "Negócios".</w:t>
+                  </w:r>
+                </w:p>
+                <w:p>
+                  <w:pPr>
+                    <w:rPr/>
+                  </w:pPr>
+                  <w:r>
+                    <w:rPr>
+                      <w:rtl w:val="0"/>
+                    </w:rPr>
+                    <w:t xml:space="preserve">19. Salva.</w:t>
+                  </w:r>
+                </w:p>
+                <w:p>
+                  <w:pPr>
+                    <w:rPr/>
+                  </w:pPr>
+                  <w:r>
+                    <w:rPr>
+                      <w:rtl w:val="0"/>
+                    </w:rPr>
+                    <w:t xml:space="preserve">20. O sistema atualiza a lista de bagagem e sugestões.</w:t>
+                  </w:r>
+                </w:p>
+                <w:p>
+                  <w:pPr>
+                    <w:spacing w:line="240" w:lineRule="auto"/>
+                    <w:rPr>
+                      <w:sz w:val="24"/>
+                      <w:szCs w:val="24"/>
+                    </w:rPr>
+                  </w:pPr>
+                  <w:r>
+                    <w:rPr>
+                      <w:rtl w:val="0"/>
+                    </w:rPr>
+                  </w:r>
+                </w:p>
+              </w:tc>
+            </w:tr>
+            <w:tr>
+              <w:trPr>
+                <w:cantSplit w:val="0"/>
+                <w:tblHeader w:val="0"/>
+              </w:trPr>
+              <w:tc>
+                <w:tcPr>
+                  <w:shd w:fill="999999" w:val="clear"/>
+                </w:tcPr>
+                <w:p>
+                  <w:pPr>
+                    <w:spacing w:line="240" w:lineRule="auto"/>
+                    <w:rPr>
+                      <w:b w:val="1"/>
+                      <w:bCs w:val="1"/>
+                      <w:sz w:val="24"/>
+                      <w:szCs w:val="24"/>
+                    </w:rPr>
+                  </w:pPr>
+                  <w:r>
+                    <w:rPr>
+                      <w:b w:val="1"/>
+                      <w:bCs w:val="1"/>
+                      <w:sz w:val="24"/>
+                      <w:szCs w:val="24"/>
+                      <w:rtl w:val="0"/>
+                    </w:rPr>
+                    <w:t xml:space="preserve">Fluxos Alternativos: </w:t>
+                  </w:r>
+                </w:p>
+              </w:tc>
+              <w:tc>
+                <w:tcPr/>
+                <w:p>
+                  <w:pPr>
+                    <w:numPr>
+                      <w:ilvl w:val="0"/>
+                      <w:numId w:val="3"/>
+                    </w:numPr>
+                    <w:ind w:left="720" w:hanging="360"/>
+                    <w:rPr>
+                      <w:sz w:val="24"/>
+                      <w:szCs w:val="24"/>
+                    </w:rPr>
+                  </w:pPr>
+                  <w:r>
+                    <w:rPr>
+                      <w:rtl w:val="0"/>
+                    </w:rPr>
+                    <w:t xml:space="preserve">- FA01 - Dados inválidos: exibe erros em tempo real e não salva.</w:t>
+                  </w:r>
+                </w:p>
+                <w:p>
+                  <w:pPr>
+                    <w:numPr>
+                      <w:ilvl w:val="0"/>
+                      <w:numId w:val="3"/>
+                    </w:numPr>
+                    <w:ind w:left="720" w:hanging="360"/>
+                    <w:rPr>
+                      <w:sz w:val="24"/>
+                      <w:szCs w:val="24"/>
+                    </w:rPr>
+                  </w:pPr>
+                  <w:r>
+                    <w:rPr>
+                      <w:rtl w:val="0"/>
+                    </w:rPr>
+                    <w:t xml:space="preserve">- FA02 - Usuário clica em "Cancelar": exibe confirmação de cancelamento.</w:t>
+                  </w:r>
+                </w:p>
+                <w:p>
+                  <w:pPr>
+                    <w:numPr>
+                      <w:ilvl w:val="0"/>
+                      <w:numId w:val="3"/>
+                    </w:numPr>
+                    <w:ind w:left="720" w:hanging="360"/>
+                    <w:rPr>
+                      <w:sz w:val="24"/>
+                      <w:szCs w:val="24"/>
+                    </w:rPr>
+                  </w:pPr>
+                  <w:r>
+                    <w:rPr>
+                      <w:rtl w:val="0"/>
+                    </w:rPr>
+                    <w:t xml:space="preserve">- FA03 - Senha fraca ou inválida: validação em tempo real e solicitação de nova senha forte.</w:t>
+                  </w:r>
+                  <w:r>
+                    <w:rPr>
+                      <w:rtl w:val="0"/>
+                    </w:rPr>
+                  </w:r>
+                </w:p>
+              </w:tc>
+            </w:tr>
+          </w:tbl>
+          <w:p>
+            <w:pPr>
+              <w:rPr>
+                <w:sz w:val="24"/>
+                <w:szCs w:val="24"/>
+              </w:rPr>
+            </w:pPr>
+            <w:r>
+              <w:rPr>
+                <w:rtl w:val="0"/>
+              </w:rPr>
+              <w:t xml:space="preserve">ovamente".</w:t>
+            </w:r>
+            <w:r>
+              <w:rPr>
+                <w:rtl w:val="0"/>
+              </w:rPr>
             </w:r>
           </w:p>
         </w:tc>
@@ -4902,7 +6627,7 @@
               <w:widowControl w:val="0"/>
               <w:numPr>
                 <w:ilvl w:val="0"/>
-                <w:numId w:val="1"/>
+                <w:numId w:val="4"/>
               </w:numPr>
               <w:spacing w:line="240" w:lineRule="auto"/>
               <w:ind w:left="720" w:hanging="360"/>
@@ -4919,38 +6644,22 @@
                 <w:szCs w:val="24"/>
                 <w:rtl w:val="0"/>
               </w:rPr>
-              <w:t xml:space="preserve">RN01</w:t>
-            </w:r>
-            <w:r>
-              <w:rPr>
-                <w:sz w:val="24"/>
-                <w:szCs w:val="24"/>
-                <w:rtl w:val="0"/>
-              </w:rPr>
-              <w:t xml:space="preserve">  </w:t>
-            </w:r>
-            <w:r>
-              <w:rPr>
-                <w:rtl w:val="0"/>
-              </w:rPr>
-              <w:t xml:space="preserve"> - Valor total sempre inclui todos os gastos.</w:t>
-            </w:r>
-            <w:r>
-              <w:rPr>
-                <w:rtl w:val="0"/>
-              </w:rPr>
-            </w:r>
-          </w:p>
-          <w:p>
-            <w:pPr>
-              <w:widowControl w:val="0"/>
-              <w:spacing w:line="240" w:lineRule="auto"/>
-              <w:ind w:left="720" w:firstLine="0"/>
-              <w:rPr>
-                <w:sz w:val="24"/>
-                <w:szCs w:val="24"/>
-              </w:rPr>
-            </w:pPr>
+              <w:t xml:space="preserve">RN03</w:t>
+            </w:r>
+            <w:r>
+              <w:rPr>
+                <w:sz w:val="24"/>
+                <w:szCs w:val="24"/>
+                <w:rtl w:val="0"/>
+              </w:rPr>
+              <w:t xml:space="preserve"> </w:t>
+            </w:r>
+            <w:r>
+              <w:rPr>
+                <w:rtl w:val="0"/>
+              </w:rPr>
+              <w:t xml:space="preserve">- RN01 - Valor total sempre inclui todos os gastos.</w:t>
+            </w:r>
             <w:r>
               <w:rPr>
                 <w:rtl w:val="0"/>
@@ -4962,7 +6671,7 @@
               <w:widowControl w:val="0"/>
               <w:numPr>
                 <w:ilvl w:val="0"/>
-                <w:numId w:val="1"/>
+                <w:numId w:val="4"/>
               </w:numPr>
               <w:spacing w:line="240" w:lineRule="auto"/>
               <w:ind w:left="720" w:hanging="360"/>
@@ -4981,13 +6690,13 @@
                 <w:szCs w:val="24"/>
                 <w:rtl w:val="0"/>
               </w:rPr>
-              <w:t xml:space="preserve">RF02  </w:t>
-            </w:r>
-            <w:r>
-              <w:rPr>
-                <w:rtl w:val="0"/>
-              </w:rPr>
-              <w:t xml:space="preserve"> - Nota de localização deve ser entre 1 e 5.</w:t>
+              <w:t xml:space="preserve">RF02 </w:t>
+            </w:r>
+            <w:r>
+              <w:rPr>
+                <w:rtl w:val="0"/>
+              </w:rPr>
+              <w:t xml:space="preserve">- RN02 - Nota de localização deve ser entre 1 e 5.</w:t>
             </w:r>
             <w:r>
               <w:rPr>
@@ -5009,27 +6718,17 @@
       </w:pPr>
       <w:r>
         <w:rPr>
-          <w:rtl w:val="0"/>
-        </w:rPr>
+          <w:sz w:val="24"/>
+          <w:szCs w:val="24"/>
+          <w:rtl w:val="0"/>
+        </w:rPr>
+        <w:t xml:space="preserve">  </w:t>
       </w:r>
     </w:p>
     <w:p>
       <w:pPr>
         <w:spacing w:line="360" w:lineRule="auto"/>
         <w:jc w:val="both"/>
-        <w:rPr>
-          <w:sz w:val="24"/>
-          <w:szCs w:val="24"/>
-        </w:rPr>
-      </w:pPr>
-      <w:r>
-        <w:rPr>
-          <w:rtl w:val="0"/>
-        </w:rPr>
-      </w:r>
-    </w:p>
-    <w:p>
-      <w:pPr>
         <w:rPr/>
       </w:pPr>
       <w:r>
@@ -5382,6 +7081,446 @@
       </w:rPr>
     </w:lvl>
   </w:abstractNum>
+  <w:abstractNum w:abstractNumId="4">
+    <w:lvl w:ilvl="0">
+      <w:start w:val="1"/>
+      <w:numFmt w:val="bullet"/>
+      <w:lvlText w:val="●"/>
+      <w:lvlJc w:val="left"/>
+      <w:pPr>
+        <w:ind w:left="720" w:hanging="360"/>
+      </w:pPr>
+      <w:rPr>
+        <w:u w:val="none"/>
+      </w:rPr>
+    </w:lvl>
+    <w:lvl w:ilvl="1">
+      <w:start w:val="1"/>
+      <w:numFmt w:val="bullet"/>
+      <w:lvlText w:val="○"/>
+      <w:lvlJc w:val="left"/>
+      <w:pPr>
+        <w:ind w:left="1440" w:hanging="360"/>
+      </w:pPr>
+      <w:rPr>
+        <w:u w:val="none"/>
+      </w:rPr>
+    </w:lvl>
+    <w:lvl w:ilvl="2">
+      <w:start w:val="1"/>
+      <w:numFmt w:val="bullet"/>
+      <w:lvlText w:val="■"/>
+      <w:lvlJc w:val="left"/>
+      <w:pPr>
+        <w:ind w:left="2160" w:hanging="360"/>
+      </w:pPr>
+      <w:rPr>
+        <w:u w:val="none"/>
+      </w:rPr>
+    </w:lvl>
+    <w:lvl w:ilvl="3">
+      <w:start w:val="1"/>
+      <w:numFmt w:val="bullet"/>
+      <w:lvlText w:val="●"/>
+      <w:lvlJc w:val="left"/>
+      <w:pPr>
+        <w:ind w:left="2880" w:hanging="360"/>
+      </w:pPr>
+      <w:rPr>
+        <w:u w:val="none"/>
+      </w:rPr>
+    </w:lvl>
+    <w:lvl w:ilvl="4">
+      <w:start w:val="1"/>
+      <w:numFmt w:val="bullet"/>
+      <w:lvlText w:val="○"/>
+      <w:lvlJc w:val="left"/>
+      <w:pPr>
+        <w:ind w:left="3600" w:hanging="360"/>
+      </w:pPr>
+      <w:rPr>
+        <w:u w:val="none"/>
+      </w:rPr>
+    </w:lvl>
+    <w:lvl w:ilvl="5">
+      <w:start w:val="1"/>
+      <w:numFmt w:val="bullet"/>
+      <w:lvlText w:val="■"/>
+      <w:lvlJc w:val="left"/>
+      <w:pPr>
+        <w:ind w:left="4320" w:hanging="360"/>
+      </w:pPr>
+      <w:rPr>
+        <w:u w:val="none"/>
+      </w:rPr>
+    </w:lvl>
+    <w:lvl w:ilvl="6">
+      <w:start w:val="1"/>
+      <w:numFmt w:val="bullet"/>
+      <w:lvlText w:val="●"/>
+      <w:lvlJc w:val="left"/>
+      <w:pPr>
+        <w:ind w:left="5040" w:hanging="360"/>
+      </w:pPr>
+      <w:rPr>
+        <w:u w:val="none"/>
+      </w:rPr>
+    </w:lvl>
+    <w:lvl w:ilvl="7">
+      <w:start w:val="1"/>
+      <w:numFmt w:val="bullet"/>
+      <w:lvlText w:val="○"/>
+      <w:lvlJc w:val="left"/>
+      <w:pPr>
+        <w:ind w:left="5760" w:hanging="360"/>
+      </w:pPr>
+      <w:rPr>
+        <w:u w:val="none"/>
+      </w:rPr>
+    </w:lvl>
+    <w:lvl w:ilvl="8">
+      <w:start w:val="1"/>
+      <w:numFmt w:val="bullet"/>
+      <w:lvlText w:val="■"/>
+      <w:lvlJc w:val="left"/>
+      <w:pPr>
+        <w:ind w:left="6480" w:hanging="360"/>
+      </w:pPr>
+      <w:rPr>
+        <w:u w:val="none"/>
+      </w:rPr>
+    </w:lvl>
+  </w:abstractNum>
+  <w:abstractNum w:abstractNumId="5">
+    <w:lvl w:ilvl="0">
+      <w:start w:val="1"/>
+      <w:numFmt w:val="bullet"/>
+      <w:lvlText w:val="●"/>
+      <w:lvlJc w:val="left"/>
+      <w:pPr>
+        <w:ind w:left="720" w:hanging="360"/>
+      </w:pPr>
+      <w:rPr>
+        <w:u w:val="none"/>
+      </w:rPr>
+    </w:lvl>
+    <w:lvl w:ilvl="1">
+      <w:start w:val="1"/>
+      <w:numFmt w:val="bullet"/>
+      <w:lvlText w:val="○"/>
+      <w:lvlJc w:val="left"/>
+      <w:pPr>
+        <w:ind w:left="1440" w:hanging="360"/>
+      </w:pPr>
+      <w:rPr>
+        <w:u w:val="none"/>
+      </w:rPr>
+    </w:lvl>
+    <w:lvl w:ilvl="2">
+      <w:start w:val="1"/>
+      <w:numFmt w:val="bullet"/>
+      <w:lvlText w:val="■"/>
+      <w:lvlJc w:val="left"/>
+      <w:pPr>
+        <w:ind w:left="2160" w:hanging="360"/>
+      </w:pPr>
+      <w:rPr>
+        <w:u w:val="none"/>
+      </w:rPr>
+    </w:lvl>
+    <w:lvl w:ilvl="3">
+      <w:start w:val="1"/>
+      <w:numFmt w:val="bullet"/>
+      <w:lvlText w:val="●"/>
+      <w:lvlJc w:val="left"/>
+      <w:pPr>
+        <w:ind w:left="2880" w:hanging="360"/>
+      </w:pPr>
+      <w:rPr>
+        <w:u w:val="none"/>
+      </w:rPr>
+    </w:lvl>
+    <w:lvl w:ilvl="4">
+      <w:start w:val="1"/>
+      <w:numFmt w:val="bullet"/>
+      <w:lvlText w:val="○"/>
+      <w:lvlJc w:val="left"/>
+      <w:pPr>
+        <w:ind w:left="3600" w:hanging="360"/>
+      </w:pPr>
+      <w:rPr>
+        <w:u w:val="none"/>
+      </w:rPr>
+    </w:lvl>
+    <w:lvl w:ilvl="5">
+      <w:start w:val="1"/>
+      <w:numFmt w:val="bullet"/>
+      <w:lvlText w:val="■"/>
+      <w:lvlJc w:val="left"/>
+      <w:pPr>
+        <w:ind w:left="4320" w:hanging="360"/>
+      </w:pPr>
+      <w:rPr>
+        <w:u w:val="none"/>
+      </w:rPr>
+    </w:lvl>
+    <w:lvl w:ilvl="6">
+      <w:start w:val="1"/>
+      <w:numFmt w:val="bullet"/>
+      <w:lvlText w:val="●"/>
+      <w:lvlJc w:val="left"/>
+      <w:pPr>
+        <w:ind w:left="5040" w:hanging="360"/>
+      </w:pPr>
+      <w:rPr>
+        <w:u w:val="none"/>
+      </w:rPr>
+    </w:lvl>
+    <w:lvl w:ilvl="7">
+      <w:start w:val="1"/>
+      <w:numFmt w:val="bullet"/>
+      <w:lvlText w:val="○"/>
+      <w:lvlJc w:val="left"/>
+      <w:pPr>
+        <w:ind w:left="5760" w:hanging="360"/>
+      </w:pPr>
+      <w:rPr>
+        <w:u w:val="none"/>
+      </w:rPr>
+    </w:lvl>
+    <w:lvl w:ilvl="8">
+      <w:start w:val="1"/>
+      <w:numFmt w:val="bullet"/>
+      <w:lvlText w:val="■"/>
+      <w:lvlJc w:val="left"/>
+      <w:pPr>
+        <w:ind w:left="6480" w:hanging="360"/>
+      </w:pPr>
+      <w:rPr>
+        <w:u w:val="none"/>
+      </w:rPr>
+    </w:lvl>
+  </w:abstractNum>
+  <w:abstractNum w:abstractNumId="6">
+    <w:lvl w:ilvl="0">
+      <w:start w:val="1"/>
+      <w:numFmt w:val="bullet"/>
+      <w:lvlText w:val="●"/>
+      <w:lvlJc w:val="left"/>
+      <w:pPr>
+        <w:ind w:left="720" w:hanging="360"/>
+      </w:pPr>
+      <w:rPr>
+        <w:u w:val="none"/>
+      </w:rPr>
+    </w:lvl>
+    <w:lvl w:ilvl="1">
+      <w:start w:val="1"/>
+      <w:numFmt w:val="bullet"/>
+      <w:lvlText w:val="○"/>
+      <w:lvlJc w:val="left"/>
+      <w:pPr>
+        <w:ind w:left="1440" w:hanging="360"/>
+      </w:pPr>
+      <w:rPr>
+        <w:u w:val="none"/>
+      </w:rPr>
+    </w:lvl>
+    <w:lvl w:ilvl="2">
+      <w:start w:val="1"/>
+      <w:numFmt w:val="bullet"/>
+      <w:lvlText w:val="■"/>
+      <w:lvlJc w:val="left"/>
+      <w:pPr>
+        <w:ind w:left="2160" w:hanging="360"/>
+      </w:pPr>
+      <w:rPr>
+        <w:u w:val="none"/>
+      </w:rPr>
+    </w:lvl>
+    <w:lvl w:ilvl="3">
+      <w:start w:val="1"/>
+      <w:numFmt w:val="bullet"/>
+      <w:lvlText w:val="●"/>
+      <w:lvlJc w:val="left"/>
+      <w:pPr>
+        <w:ind w:left="2880" w:hanging="360"/>
+      </w:pPr>
+      <w:rPr>
+        <w:u w:val="none"/>
+      </w:rPr>
+    </w:lvl>
+    <w:lvl w:ilvl="4">
+      <w:start w:val="1"/>
+      <w:numFmt w:val="bullet"/>
+      <w:lvlText w:val="○"/>
+      <w:lvlJc w:val="left"/>
+      <w:pPr>
+        <w:ind w:left="3600" w:hanging="360"/>
+      </w:pPr>
+      <w:rPr>
+        <w:u w:val="none"/>
+      </w:rPr>
+    </w:lvl>
+    <w:lvl w:ilvl="5">
+      <w:start w:val="1"/>
+      <w:numFmt w:val="bullet"/>
+      <w:lvlText w:val="■"/>
+      <w:lvlJc w:val="left"/>
+      <w:pPr>
+        <w:ind w:left="4320" w:hanging="360"/>
+      </w:pPr>
+      <w:rPr>
+        <w:u w:val="none"/>
+      </w:rPr>
+    </w:lvl>
+    <w:lvl w:ilvl="6">
+      <w:start w:val="1"/>
+      <w:numFmt w:val="bullet"/>
+      <w:lvlText w:val="●"/>
+      <w:lvlJc w:val="left"/>
+      <w:pPr>
+        <w:ind w:left="5040" w:hanging="360"/>
+      </w:pPr>
+      <w:rPr>
+        <w:u w:val="none"/>
+      </w:rPr>
+    </w:lvl>
+    <w:lvl w:ilvl="7">
+      <w:start w:val="1"/>
+      <w:numFmt w:val="bullet"/>
+      <w:lvlText w:val="○"/>
+      <w:lvlJc w:val="left"/>
+      <w:pPr>
+        <w:ind w:left="5760" w:hanging="360"/>
+      </w:pPr>
+      <w:rPr>
+        <w:u w:val="none"/>
+      </w:rPr>
+    </w:lvl>
+    <w:lvl w:ilvl="8">
+      <w:start w:val="1"/>
+      <w:numFmt w:val="bullet"/>
+      <w:lvlText w:val="■"/>
+      <w:lvlJc w:val="left"/>
+      <w:pPr>
+        <w:ind w:left="6480" w:hanging="360"/>
+      </w:pPr>
+      <w:rPr>
+        <w:u w:val="none"/>
+      </w:rPr>
+    </w:lvl>
+  </w:abstractNum>
+  <w:abstractNum w:abstractNumId="7">
+    <w:lvl w:ilvl="0">
+      <w:start w:val="1"/>
+      <w:numFmt w:val="bullet"/>
+      <w:lvlText w:val="●"/>
+      <w:lvlJc w:val="left"/>
+      <w:pPr>
+        <w:ind w:left="720" w:hanging="360"/>
+      </w:pPr>
+      <w:rPr>
+        <w:u w:val="none"/>
+      </w:rPr>
+    </w:lvl>
+    <w:lvl w:ilvl="1">
+      <w:start w:val="1"/>
+      <w:numFmt w:val="bullet"/>
+      <w:lvlText w:val="○"/>
+      <w:lvlJc w:val="left"/>
+      <w:pPr>
+        <w:ind w:left="1440" w:hanging="360"/>
+      </w:pPr>
+      <w:rPr>
+        <w:u w:val="none"/>
+      </w:rPr>
+    </w:lvl>
+    <w:lvl w:ilvl="2">
+      <w:start w:val="1"/>
+      <w:numFmt w:val="bullet"/>
+      <w:lvlText w:val="■"/>
+      <w:lvlJc w:val="left"/>
+      <w:pPr>
+        <w:ind w:left="2160" w:hanging="360"/>
+      </w:pPr>
+      <w:rPr>
+        <w:u w:val="none"/>
+      </w:rPr>
+    </w:lvl>
+    <w:lvl w:ilvl="3">
+      <w:start w:val="1"/>
+      <w:numFmt w:val="bullet"/>
+      <w:lvlText w:val="●"/>
+      <w:lvlJc w:val="left"/>
+      <w:pPr>
+        <w:ind w:left="2880" w:hanging="360"/>
+      </w:pPr>
+      <w:rPr>
+        <w:u w:val="none"/>
+      </w:rPr>
+    </w:lvl>
+    <w:lvl w:ilvl="4">
+      <w:start w:val="1"/>
+      <w:numFmt w:val="bullet"/>
+      <w:lvlText w:val="○"/>
+      <w:lvlJc w:val="left"/>
+      <w:pPr>
+        <w:ind w:left="3600" w:hanging="360"/>
+      </w:pPr>
+      <w:rPr>
+        <w:u w:val="none"/>
+      </w:rPr>
+    </w:lvl>
+    <w:lvl w:ilvl="5">
+      <w:start w:val="1"/>
+      <w:numFmt w:val="bullet"/>
+      <w:lvlText w:val="■"/>
+      <w:lvlJc w:val="left"/>
+      <w:pPr>
+        <w:ind w:left="4320" w:hanging="360"/>
+      </w:pPr>
+      <w:rPr>
+        <w:u w:val="none"/>
+      </w:rPr>
+    </w:lvl>
+    <w:lvl w:ilvl="6">
+      <w:start w:val="1"/>
+      <w:numFmt w:val="bullet"/>
+      <w:lvlText w:val="●"/>
+      <w:lvlJc w:val="left"/>
+      <w:pPr>
+        <w:ind w:left="5040" w:hanging="360"/>
+      </w:pPr>
+      <w:rPr>
+        <w:u w:val="none"/>
+      </w:rPr>
+    </w:lvl>
+    <w:lvl w:ilvl="7">
+      <w:start w:val="1"/>
+      <w:numFmt w:val="bullet"/>
+      <w:lvlText w:val="○"/>
+      <w:lvlJc w:val="left"/>
+      <w:pPr>
+        <w:ind w:left="5760" w:hanging="360"/>
+      </w:pPr>
+      <w:rPr>
+        <w:u w:val="none"/>
+      </w:rPr>
+    </w:lvl>
+    <w:lvl w:ilvl="8">
+      <w:start w:val="1"/>
+      <w:numFmt w:val="bullet"/>
+      <w:lvlText w:val="■"/>
+      <w:lvlJc w:val="left"/>
+      <w:pPr>
+        <w:ind w:left="6480" w:hanging="360"/>
+      </w:pPr>
+      <w:rPr>
+        <w:u w:val="none"/>
+      </w:rPr>
+    </w:lvl>
+  </w:abstractNum>
   <w:num w:numId="1">
     <w:abstractNumId w:val="1"/>
   </w:num>
@@ -5390,6 +7529,18 @@
   </w:num>
   <w:num w:numId="3">
     <w:abstractNumId w:val="3"/>
+  </w:num>
+  <w:num w:numId="4">
+    <w:abstractNumId w:val="4"/>
+  </w:num>
+  <w:num w:numId="5">
+    <w:abstractNumId w:val="5"/>
+  </w:num>
+  <w:num w:numId="6">
+    <w:abstractNumId w:val="6"/>
+  </w:num>
+  <w:num w:numId="7">
+    <w:abstractNumId w:val="7"/>
   </w:num>
 </w:numbering>
 </file>
@@ -5581,6 +7732,20 @@
     </w:tblPr>
   </w:style>
   <w:style w:type="table" w:styleId="Table4">
+    <w:basedOn w:val="TableNormal"/>
+    <w:tblPr>
+      <w:tblStyleRowBandSize w:val="1"/>
+      <w:tblStyleColBandSize w:val="1"/>
+    </w:tblPr>
+  </w:style>
+  <w:style w:type="table" w:styleId="Table5">
+    <w:basedOn w:val="TableNormal"/>
+    <w:tblPr>
+      <w:tblStyleRowBandSize w:val="1"/>
+      <w:tblStyleColBandSize w:val="1"/>
+    </w:tblPr>
+  </w:style>
+  <w:style w:type="table" w:styleId="Table6">
     <w:basedOn w:val="TableNormal"/>
     <w:tblPr>
       <w:tblStyleRowBandSize w:val="1"/>

</xml_diff>